<commit_message>
Refresh frontend portfolio presentation
Co-authored-by: Copilot <223556219+Copilot@users.noreply.github.com>
</commit_message>
<xml_diff>
--- a/assets/Sowmya_Puttur_Senior_Frontend_React_Engineer_Resume.docx
+++ b/assets/Sowmya_Puttur_Senior_Frontend_React_Engineer_Resume.docx
@@ -9,6 +9,8 @@
         <w:rPr>
           <w:rFonts w:ascii="Arial" w:hAnsi="Arial" w:cs="Arial"/>
           <w:color w:val="396BA7"/>
+          <w:sz w:val="24"/>
+          <w:szCs w:val="24"/>
         </w:rPr>
       </w:pPr>
       <w:r>
@@ -16,127 +18,99 @@
           <w:rFonts w:ascii="Arial" w:hAnsi="Arial" w:cs="Arial"/>
           <w:b w:val="1"/>
           <w:color w:val="396BA7"/>
-          <w:sz w:val="38"/>
+          <w:sz w:val="24"/>
+          <w:szCs w:val="24"/>
         </w:rPr>
         <w:t>SOWMYA PUTTUR</w:t>
       </w:r>
     </w:p>
     <w:p>
       <w:pPr>
+        <w:ind w:hanging="141" w:left="-284"/>
         <w:jc w:val="center"/>
-        <w:rPr>
-          <w:rFonts w:ascii="Arial" w:hAnsi="Arial" w:cs="Arial"/>
-          <w:color w:val="093367"/>
-          <w:sz w:val="22"/>
-          <w:szCs w:val="22"/>
-        </w:rPr>
-      </w:pPr>
-      <w:r>
         <w:rPr>
           <w:rFonts w:ascii="Arial" w:hAnsi="Arial" w:cs="Arial"/>
           <w:b w:val="1"/>
           <w:color w:val="093367"/>
-          <w:sz w:val="22"/>
-          <w:szCs w:val="22"/>
-        </w:rPr>
-        <w:t>SENIOR FRONTEND ENGINEER</w:t>
+          <w:sz w:val="18"/>
+          <w:szCs w:val="18"/>
+          <w:rtl w:val="0"/>
+          <w:lang w:val="en-IN" w:bidi="en-IN" w:eastAsia="en-IN"/>
+        </w:rPr>
+      </w:pPr>
+      <w:r>
+        <w:rPr>
+          <w:rFonts w:ascii="Arial" w:hAnsi="Arial" w:cs="Arial"/>
+          <w:b w:val="1"/>
+          <w:color w:val="093367"/>
+          <w:sz w:val="18"/>
+          <w:szCs w:val="18"/>
+        </w:rPr>
+        <w:t xml:space="preserve">SENIOR </w:t>
       </w:r>
       <w:r>
         <w:rPr>
           <w:rFonts w:ascii="Arial" w:hAnsi="Arial" w:cs="Arial"/>
           <w:b w:val="1"/>
           <w:color w:val="093367"/>
-          <w:sz w:val="22"/>
-          <w:szCs w:val="22"/>
+          <w:sz w:val="18"/>
+          <w:szCs w:val="18"/>
           <w:rtl w:val="0"/>
           <w:lang w:val="en-IN" w:bidi="en-IN" w:eastAsia="en-IN"/>
         </w:rPr>
-        <w:t xml:space="preserve"> - REACT,</w:t>
-      </w:r>
-      <w:r>
-        <w:rPr>
-          <w:rFonts w:ascii="Arial" w:hAnsi="Arial" w:cs="Arial"/>
-          <w:b w:val="1"/>
-          <w:color w:val="093367"/>
-          <w:sz w:val="22"/>
-          <w:szCs w:val="22"/>
-          <w:rtl w:val="0"/>
-          <w:lang w:val="en-IN" w:bidi="en-IN" w:eastAsia="en-IN"/>
-        </w:rPr>
-        <w:t xml:space="preserve"> NEXT.J</w:t>
-      </w:r>
-      <w:r>
-        <w:rPr>
-          <w:rFonts w:ascii="Arial" w:hAnsi="Arial" w:cs="Arial"/>
-          <w:b w:val="1"/>
-          <w:color w:val="093367"/>
-          <w:sz w:val="22"/>
-          <w:szCs w:val="22"/>
-          <w:rtl w:val="0"/>
-          <w:lang w:val="en-IN" w:bidi="en-IN" w:eastAsia="en-IN"/>
-        </w:rPr>
-        <w:t>S,</w:t>
-      </w:r>
-      <w:r>
-        <w:rPr>
-          <w:rFonts w:ascii="Arial" w:hAnsi="Arial" w:cs="Arial"/>
-          <w:b w:val="1"/>
-          <w:color w:val="093367"/>
-          <w:sz w:val="22"/>
-          <w:szCs w:val="22"/>
-          <w:rtl w:val="0"/>
-          <w:lang w:val="en-IN" w:bidi="en-IN" w:eastAsia="en-IN"/>
-        </w:rPr>
-        <w:t xml:space="preserve"> ANGULAR,</w:t>
-      </w:r>
-      <w:r>
-        <w:rPr>
-          <w:rFonts w:ascii="Arial" w:hAnsi="Arial" w:cs="Arial"/>
-          <w:b w:val="1"/>
-          <w:color w:val="093367"/>
-          <w:sz w:val="22"/>
-          <w:szCs w:val="22"/>
-          <w:rtl w:val="0"/>
-          <w:lang w:val="en-IN" w:bidi="en-IN" w:eastAsia="en-IN"/>
-        </w:rPr>
-        <w:t xml:space="preserve"> </w:t>
-      </w:r>
-      <w:r>
-        <w:rPr>
-          <w:rFonts w:ascii="Arial" w:hAnsi="Arial" w:cs="Arial"/>
-          <w:b w:val="1"/>
-          <w:color w:val="093367"/>
-          <w:sz w:val="22"/>
-          <w:szCs w:val="22"/>
-          <w:rtl w:val="0"/>
-          <w:lang w:val="en-IN" w:bidi="en-IN" w:eastAsia="en-IN"/>
-        </w:rPr>
-        <w:t>TYPESCRIPT</w:t>
+        <w:t>WEB DEVELOPER - REACT, ANGULAR, VUE.js, JAVASCRIPT, TYPESCRIPT</w:t>
       </w:r>
     </w:p>
     <w:p>
       <w:pPr>
         <w:spacing w:after="120" w:beforeAutospacing="0" w:afterAutospacing="0"/>
-        <w:ind w:hanging="567" w:right="-403"/>
+        <w:ind w:hanging="142" w:left="-567" w:right="-403"/>
         <w:jc w:val="center"/>
         <w:rPr>
           <w:rFonts w:ascii="Arial" w:hAnsi="Arial" w:cs="Arial"/>
           <w:color w:val="B45303"/>
+          <w:sz w:val="18"/>
+          <w:szCs w:val="18"/>
         </w:rPr>
       </w:pPr>
       <w:r>
         <w:rPr>
           <w:rFonts w:ascii="Arial" w:hAnsi="Arial" w:cs="Arial"/>
           <w:color w:val="B45303"/>
-          <w:sz w:val="17"/>
-        </w:rPr>
-        <w:t xml:space="preserve">Toronto, ON, Canada  |  +1 (437) 518-9894  |  sowmyaputtur0110@gmail.com  |  </w:t>
+          <w:sz w:val="18"/>
+          <w:szCs w:val="18"/>
+        </w:rPr>
+        <w:t xml:space="preserve">Toronto, ON, Canada  |  +1 (437) 518-9894  |  </w:t>
       </w:r>
       <w:r>
         <w:rPr>
           <w:rFonts w:ascii="Arial" w:hAnsi="Arial" w:cs="Arial"/>
           <w:color w:val="B45303"/>
-          <w:sz w:val="17"/>
+          <w:sz w:val="18"/>
+          <w:szCs w:val="18"/>
+          <w:u w:val="none"/>
+        </w:rPr>
+        <w:t>sowmyaputtur0110@gmail.com</w:t>
+      </w:r>
+    </w:p>
+    <w:p>
+      <w:pPr>
+        <w:spacing w:after="120" w:beforeAutospacing="0" w:afterAutospacing="0"/>
+        <w:ind w:hanging="142" w:left="-567" w:right="-403"/>
+        <w:jc w:val="center"/>
+        <w:rPr>
+          <w:rFonts w:ascii="Arial" w:hAnsi="Arial" w:cs="Arial"/>
+          <w:color w:val="B45303"/>
+          <w:sz w:val="18"/>
+          <w:szCs w:val="18"/>
+        </w:rPr>
+      </w:pPr>
+      <w:r>
+        <w:rPr>
+          <w:rFonts w:ascii="Arial" w:hAnsi="Arial" w:cs="Arial"/>
+          <w:color w:val="B45303"/>
+          <w:sz w:val="18"/>
+          <w:szCs w:val="18"/>
           <w:u w:val="none"/>
         </w:rPr>
         <w:t>linkedin.com/in/sowmya-puttur</w:t>
@@ -145,7 +119,8 @@
         <w:rPr>
           <w:rFonts w:ascii="Arial" w:hAnsi="Arial" w:cs="Arial"/>
           <w:color w:val="B45303"/>
-          <w:sz w:val="17"/>
+          <w:sz w:val="18"/>
+          <w:szCs w:val="18"/>
           <w:rtl w:val="0"/>
           <w:lang w:val="en-IN" w:bidi="en-IN" w:eastAsia="en-IN"/>
         </w:rPr>
@@ -155,11 +130,24 @@
         <w:rPr>
           <w:rFonts w:ascii="Arial" w:hAnsi="Arial" w:cs="Arial"/>
           <w:color w:val="B45303"/>
-          <w:sz w:val="17"/>
+          <w:sz w:val="18"/>
+          <w:szCs w:val="18"/>
+          <w:u w:val="none"/>
           <w:rtl w:val="0"/>
           <w:lang w:val="en-IN" w:bidi="en-IN" w:eastAsia="en-IN"/>
         </w:rPr>
-        <w:tab/>
+        <w:t>https://sowmyaputtur.github.io</w:t>
+      </w:r>
+      <w:r>
+        <w:rPr>
+          <w:rFonts w:ascii="Arial" w:hAnsi="Arial" w:cs="Arial"/>
+          <w:color w:val="B45303"/>
+          <w:sz w:val="18"/>
+          <w:szCs w:val="18"/>
+          <w:rtl w:val="0"/>
+          <w:lang w:val="en-IN" w:bidi="en-IN" w:eastAsia="en-IN"/>
+        </w:rPr>
+        <w:t xml:space="preserve"> | https://github.com/sowmyaputtur</w:t>
       </w:r>
     </w:p>
     <w:p>
@@ -176,7 +164,8 @@
           <w:rFonts w:ascii="Arial" w:hAnsi="Arial" w:cs="Arial"/>
           <w:b w:val="1"/>
           <w:color w:val="446EA2"/>
-          <w:sz w:val="21"/>
+          <w:sz w:val="18"/>
+          <w:szCs w:val="18"/>
         </w:rPr>
       </w:pPr>
     </w:p>
@@ -193,6 +182,8 @@
         <w:rPr>
           <w:rFonts w:ascii="Arial" w:hAnsi="Arial" w:cs="Arial"/>
           <w:color w:val="446EA2"/>
+          <w:sz w:val="18"/>
+          <w:szCs w:val="18"/>
         </w:rPr>
       </w:pPr>
       <w:r>
@@ -200,7 +191,8 @@
           <w:rFonts w:ascii="Arial" w:hAnsi="Arial" w:cs="Arial"/>
           <w:b w:val="1"/>
           <w:color w:val="446EA2"/>
-          <w:sz w:val="21"/>
+          <w:sz w:val="18"/>
+          <w:szCs w:val="18"/>
         </w:rPr>
         <w:t>PROFESSIONAL SUMMARY</w:t>
       </w:r>
@@ -209,17 +201,23 @@
       <w:pPr>
         <w:rPr>
           <w:rFonts w:ascii="Arial" w:hAnsi="Arial" w:cs="Arial"/>
+          <w:sz w:val="18"/>
+          <w:szCs w:val="18"/>
         </w:rPr>
       </w:pPr>
       <w:r>
         <w:rPr>
           <w:rFonts w:ascii="Arial" w:hAnsi="Arial" w:cs="Arial"/>
+          <w:sz w:val="18"/>
+          <w:szCs w:val="18"/>
         </w:rPr>
         <w:t xml:space="preserve">Senior Frontend </w:t>
       </w:r>
       <w:r>
         <w:rPr>
           <w:rFonts w:ascii="Arial" w:hAnsi="Arial" w:cs="Arial"/>
+          <w:sz w:val="18"/>
+          <w:szCs w:val="18"/>
           <w:rtl w:val="0"/>
           <w:lang w:val="en-IN" w:bidi="en-IN" w:eastAsia="en-IN"/>
         </w:rPr>
@@ -228,6 +226,8 @@
       <w:r>
         <w:rPr>
           <w:rFonts w:ascii="Arial" w:hAnsi="Arial" w:cs="Arial"/>
+          <w:sz w:val="18"/>
+          <w:szCs w:val="18"/>
         </w:rPr>
         <w:t xml:space="preserve">with 8.5 years of experience building scalable web applications, specializing in </w:t>
       </w:r>
@@ -236,6 +236,8 @@
           <w:rFonts w:ascii="Arial" w:hAnsi="Arial" w:cs="Arial"/>
           <w:b w:val="1"/>
           <w:bCs w:val="1"/>
+          <w:sz w:val="18"/>
+          <w:szCs w:val="18"/>
         </w:rPr>
         <w:t xml:space="preserve">React, Redux, React Hooks, </w:t>
       </w:r>
@@ -244,6 +246,8 @@
           <w:rFonts w:ascii="Arial" w:hAnsi="Arial" w:cs="Arial"/>
           <w:b w:val="1"/>
           <w:bCs w:val="1"/>
+          <w:sz w:val="18"/>
+          <w:szCs w:val="18"/>
           <w:rtl w:val="0"/>
           <w:lang w:val="en-IN" w:bidi="en-IN" w:eastAsia="en-IN"/>
         </w:rPr>
@@ -254,6 +258,8 @@
           <w:rFonts w:ascii="Arial" w:hAnsi="Arial" w:cs="Arial"/>
           <w:b w:val="1"/>
           <w:bCs w:val="1"/>
+          <w:sz w:val="18"/>
+          <w:szCs w:val="18"/>
         </w:rPr>
         <w:t xml:space="preserve">TypeScript, JavaScript, </w:t>
       </w:r>
@@ -262,6 +268,8 @@
           <w:rFonts w:ascii="Arial" w:hAnsi="Arial" w:cs="Arial"/>
           <w:b w:val="1"/>
           <w:bCs w:val="1"/>
+          <w:sz w:val="18"/>
+          <w:szCs w:val="18"/>
           <w:rtl w:val="0"/>
           <w:lang w:val="en-IN" w:bidi="en-IN" w:eastAsia="en-IN"/>
         </w:rPr>
@@ -272,12 +280,16 @@
           <w:rFonts w:ascii="Arial" w:hAnsi="Arial" w:cs="Arial"/>
           <w:b w:val="1"/>
           <w:bCs w:val="1"/>
+          <w:sz w:val="18"/>
+          <w:szCs w:val="18"/>
         </w:rPr>
         <w:t>HTML5 and CSS3</w:t>
       </w:r>
       <w:r>
         <w:rPr>
           <w:rFonts w:ascii="Arial" w:hAnsi="Arial" w:cs="Arial"/>
+          <w:sz w:val="18"/>
+          <w:szCs w:val="18"/>
         </w:rPr>
         <w:t xml:space="preserve">. Delivered </w:t>
       </w:r>
@@ -286,12 +298,16 @@
           <w:rFonts w:ascii="Arial" w:hAnsi="Arial" w:cs="Arial"/>
           <w:b w:val="1"/>
           <w:bCs w:val="1"/>
+          <w:sz w:val="18"/>
+          <w:szCs w:val="18"/>
         </w:rPr>
         <w:t>large-scale enterprise applications for Microsoft</w:t>
       </w:r>
       <w:r>
         <w:rPr>
           <w:rFonts w:ascii="Arial" w:hAnsi="Arial" w:cs="Arial"/>
+          <w:sz w:val="18"/>
+          <w:szCs w:val="18"/>
         </w:rPr>
         <w:t xml:space="preserve">, including secure MSAL Single Sign-On, Redux/Flux state management for large datasets, reusable component libraries (30% efficiency gain), WCAG 2.1 AA accessibility, and a Fluent UI React application backed by Azure SQL. Also built </w:t>
       </w:r>
@@ -300,18 +316,24 @@
           <w:rFonts w:ascii="Arial" w:hAnsi="Arial" w:cs="Arial"/>
           <w:b w:val="1"/>
           <w:bCs w:val="1"/>
+          <w:sz w:val="18"/>
+          <w:szCs w:val="18"/>
         </w:rPr>
         <w:t>retail and eCommerce applications</w:t>
       </w:r>
       <w:r>
         <w:rPr>
           <w:rFonts w:ascii="Arial" w:hAnsi="Arial" w:cs="Arial"/>
+          <w:sz w:val="18"/>
+          <w:szCs w:val="18"/>
         </w:rPr>
         <w:t xml:space="preserve"> (</w:t>
       </w:r>
       <w:r>
         <w:rPr>
           <w:rFonts w:ascii="Arial" w:hAnsi="Arial" w:cs="Arial"/>
+          <w:sz w:val="18"/>
+          <w:szCs w:val="18"/>
           <w:rtl w:val="0"/>
           <w:lang w:val="en-IN" w:bidi="en-IN" w:eastAsia="en-IN"/>
         </w:rPr>
@@ -320,6 +342,8 @@
       <w:r>
         <w:rPr>
           <w:rFonts w:ascii="Arial" w:hAnsi="Arial" w:cs="Arial"/>
+          <w:sz w:val="18"/>
+          <w:szCs w:val="18"/>
         </w:rPr>
         <w:t xml:space="preserve">order execution, order history, returns) integrating REST APIs for live transactional data. Experienced with </w:t>
       </w:r>
@@ -328,12 +352,16 @@
           <w:rFonts w:ascii="Arial" w:hAnsi="Arial" w:cs="Arial"/>
           <w:b w:val="1"/>
           <w:bCs w:val="1"/>
+          <w:sz w:val="18"/>
+          <w:szCs w:val="18"/>
         </w:rPr>
         <w:t>CI/CD and pull-request review gates on Azure DevOps</w:t>
       </w:r>
       <w:r>
         <w:rPr>
           <w:rFonts w:ascii="Arial" w:hAnsi="Arial" w:cs="Arial"/>
+          <w:sz w:val="18"/>
+          <w:szCs w:val="18"/>
         </w:rPr>
         <w:t xml:space="preserve"> and Git/GitHub workflows (including GitHub CLI), with working knowledge of Node.js for API integration. </w:t>
       </w:r>
@@ -342,6 +370,8 @@
       <w:r>
         <w:rPr>
           <w:rFonts w:ascii="Arial" w:hAnsi="Arial" w:cs="Arial"/>
+          <w:sz w:val="18"/>
+          <w:szCs w:val="18"/>
         </w:rPr>
         <w:t xml:space="preserve">Quality-minded, with hands-on testing in </w:t>
       </w:r>
@@ -350,12 +380,16 @@
           <w:rFonts w:ascii="Arial" w:hAnsi="Arial" w:cs="Arial"/>
           <w:b w:val="1"/>
           <w:bCs w:val="1"/>
+          <w:sz w:val="18"/>
+          <w:szCs w:val="18"/>
         </w:rPr>
         <w:t xml:space="preserve">React Testing Library, Playwright, Cypress Studio, Karma and Jasmine. </w:t>
       </w:r>
       <w:r>
         <w:rPr>
           <w:rFonts w:ascii="Arial" w:hAnsi="Arial" w:cs="Arial"/>
+          <w:sz w:val="18"/>
+          <w:szCs w:val="18"/>
         </w:rPr>
         <w:t>Comfortable in Agile teams, working closely with customers and teammates from gathering requirements and estimating through to design</w:t>
       </w:r>
@@ -366,6 +400,8 @@
       <w:pPr>
         <w:rPr>
           <w:rFonts w:ascii="Arial" w:hAnsi="Arial" w:cs="Arial"/>
+          <w:sz w:val="18"/>
+          <w:szCs w:val="18"/>
         </w:rPr>
       </w:pPr>
     </w:p>
@@ -382,6 +418,8 @@
         <w:rPr>
           <w:rFonts w:ascii="Arial" w:hAnsi="Arial" w:cs="Arial"/>
           <w:color w:val="446EA2"/>
+          <w:sz w:val="18"/>
+          <w:szCs w:val="18"/>
         </w:rPr>
       </w:pPr>
       <w:r>
@@ -389,7 +427,8 @@
           <w:rFonts w:ascii="Arial" w:hAnsi="Arial" w:cs="Arial"/>
           <w:b w:val="1"/>
           <w:color w:val="446EA2"/>
-          <w:sz w:val="21"/>
+          <w:sz w:val="18"/>
+          <w:szCs w:val="18"/>
         </w:rPr>
         <w:t>CORE TECHNICAL SKILLS</w:t>
       </w:r>
@@ -400,8 +439,13 @@
           <w:ilvl w:val="0"/>
           <w:numId w:val="37"/>
         </w:numPr>
-        <w:spacing w:before="0" w:after="0"/>
+        <w:spacing w:before="0" w:after="0" w:beforeAutospacing="0" w:afterAutospacing="0"/>
         <w:ind w:hanging="360" w:left="720" w:right="0"/>
+        <w:rPr>
+          <w:rFonts w:ascii="Arial" w:hAnsi="Arial" w:cs="Arial"/>
+          <w:sz w:val="18"/>
+          <w:szCs w:val="18"/>
+        </w:rPr>
       </w:pPr>
       <w:bookmarkStart w:id="2" w:name="_dx_frag_StartFragment"/>
       <w:bookmarkEnd w:id="2"/>
@@ -411,12 +455,20 @@
       <w:bookmarkEnd w:id="4"/>
       <w:r>
         <w:rPr>
+          <w:rFonts w:ascii="Arial" w:hAnsi="Arial" w:cs="Arial"/>
           <w:b w:val="1"/>
           <w:bCs w:val="1"/>
+          <w:sz w:val="18"/>
+          <w:szCs w:val="18"/>
         </w:rPr>
         <w:t>Front-End:</w:t>
       </w:r>
       <w:r>
+        <w:rPr>
+          <w:rFonts w:ascii="Arial" w:hAnsi="Arial" w:cs="Arial"/>
+          <w:sz w:val="18"/>
+          <w:szCs w:val="18"/>
+        </w:rPr>
         <w:t xml:space="preserve"> Angular (v12+), RxJS, React, React Hooks, Redux, Next.js (side project), TypeScript, JavaScript (ES6+), Vue.js (side project), React Native, HTML5, CSS3, SCSS, Bootstrap, responsive design</w:t>
       </w:r>
     </w:p>
@@ -426,17 +478,30 @@
           <w:ilvl w:val="0"/>
           <w:numId w:val="37"/>
         </w:numPr>
-        <w:spacing w:before="0" w:after="0"/>
+        <w:spacing w:before="0" w:after="0" w:beforeAutospacing="0" w:afterAutospacing="0"/>
         <w:ind w:hanging="360" w:left="720" w:right="0"/>
+        <w:rPr>
+          <w:rFonts w:ascii="Arial" w:hAnsi="Arial" w:cs="Arial"/>
+          <w:sz w:val="18"/>
+          <w:szCs w:val="18"/>
+        </w:rPr>
       </w:pPr>
       <w:r>
         <w:rPr>
+          <w:rFonts w:ascii="Arial" w:hAnsi="Arial" w:cs="Arial"/>
           <w:b w:val="1"/>
           <w:bCs w:val="1"/>
+          <w:sz w:val="18"/>
+          <w:szCs w:val="18"/>
         </w:rPr>
         <w:t>Back-End and Data:</w:t>
       </w:r>
       <w:r>
+        <w:rPr>
+          <w:rFonts w:ascii="Arial" w:hAnsi="Arial" w:cs="Arial"/>
+          <w:sz w:val="18"/>
+          <w:szCs w:val="18"/>
+        </w:rPr>
         <w:t xml:space="preserve"> REST APIs (building and consuming), Node.js (working knowledge), Azure SQL, relational databases, CSV upload</w:t>
       </w:r>
     </w:p>
@@ -446,17 +511,30 @@
           <w:ilvl w:val="0"/>
           <w:numId w:val="37"/>
         </w:numPr>
-        <w:spacing w:before="0" w:after="0"/>
+        <w:spacing w:before="0" w:after="0" w:beforeAutospacing="0" w:afterAutospacing="0"/>
         <w:ind w:hanging="360" w:left="720" w:right="0"/>
+        <w:rPr>
+          <w:rFonts w:ascii="Arial" w:hAnsi="Arial" w:cs="Arial"/>
+          <w:sz w:val="18"/>
+          <w:szCs w:val="18"/>
+        </w:rPr>
       </w:pPr>
       <w:r>
         <w:rPr>
+          <w:rFonts w:ascii="Arial" w:hAnsi="Arial" w:cs="Arial"/>
           <w:b w:val="1"/>
           <w:bCs w:val="1"/>
+          <w:sz w:val="18"/>
+          <w:szCs w:val="18"/>
         </w:rPr>
         <w:t>Cloud and CI/CD:</w:t>
       </w:r>
       <w:r>
+        <w:rPr>
+          <w:rFonts w:ascii="Arial" w:hAnsi="Arial" w:cs="Arial"/>
+          <w:sz w:val="18"/>
+          <w:szCs w:val="18"/>
+        </w:rPr>
         <w:t xml:space="preserve"> Azure DevOps Pipelines, Azure, AWS Cognito and Auth0 (proof of concept), Git workflows, GitHub, GitHub CLI, pull-request review gates, GitHub Copilot</w:t>
       </w:r>
     </w:p>
@@ -466,17 +544,30 @@
           <w:ilvl w:val="0"/>
           <w:numId w:val="37"/>
         </w:numPr>
-        <w:spacing w:before="0" w:after="0"/>
+        <w:spacing w:before="0" w:after="0" w:beforeAutospacing="0" w:afterAutospacing="0"/>
         <w:ind w:hanging="360" w:left="720" w:right="0"/>
+        <w:rPr>
+          <w:rFonts w:ascii="Arial" w:hAnsi="Arial" w:cs="Arial"/>
+          <w:sz w:val="18"/>
+          <w:szCs w:val="18"/>
+        </w:rPr>
       </w:pPr>
       <w:r>
         <w:rPr>
+          <w:rFonts w:ascii="Arial" w:hAnsi="Arial" w:cs="Arial"/>
           <w:b w:val="1"/>
           <w:bCs w:val="1"/>
+          <w:sz w:val="18"/>
+          <w:szCs w:val="18"/>
         </w:rPr>
         <w:t>Testing:</w:t>
       </w:r>
       <w:r>
+        <w:rPr>
+          <w:rFonts w:ascii="Arial" w:hAnsi="Arial" w:cs="Arial"/>
+          <w:sz w:val="18"/>
+          <w:szCs w:val="18"/>
+        </w:rPr>
         <w:t xml:space="preserve"> Unit testing, integration testing, end-to-end testing, Jasmine, Karma, Playwright, Cypress, React Testing Library, Vitest</w:t>
       </w:r>
     </w:p>
@@ -486,17 +577,30 @@
           <w:ilvl w:val="0"/>
           <w:numId w:val="37"/>
         </w:numPr>
-        <w:spacing w:before="0" w:after="0"/>
+        <w:spacing w:before="0" w:after="0" w:beforeAutospacing="0" w:afterAutospacing="0"/>
         <w:ind w:hanging="360" w:left="720" w:right="0"/>
+        <w:rPr>
+          <w:rFonts w:ascii="Arial" w:hAnsi="Arial" w:cs="Arial"/>
+          <w:sz w:val="18"/>
+          <w:szCs w:val="18"/>
+        </w:rPr>
       </w:pPr>
       <w:r>
         <w:rPr>
+          <w:rFonts w:ascii="Arial" w:hAnsi="Arial" w:cs="Arial"/>
           <w:b w:val="1"/>
           <w:bCs w:val="1"/>
+          <w:sz w:val="18"/>
+          <w:szCs w:val="18"/>
         </w:rPr>
         <w:t>UI Libraries:</w:t>
       </w:r>
       <w:r>
+        <w:rPr>
+          <w:rFonts w:ascii="Arial" w:hAnsi="Arial" w:cs="Arial"/>
+          <w:sz w:val="18"/>
+          <w:szCs w:val="18"/>
+        </w:rPr>
         <w:t xml:space="preserve"> Fluent UI, Material UI, reusable components</w:t>
       </w:r>
     </w:p>
@@ -506,17 +610,30 @@
           <w:ilvl w:val="0"/>
           <w:numId w:val="37"/>
         </w:numPr>
-        <w:spacing w:before="0" w:after="0"/>
+        <w:spacing w:before="0" w:after="0" w:beforeAutospacing="0" w:afterAutospacing="0"/>
         <w:ind w:hanging="360" w:left="720" w:right="0"/>
+        <w:rPr>
+          <w:rFonts w:ascii="Arial" w:hAnsi="Arial" w:cs="Arial"/>
+          <w:sz w:val="18"/>
+          <w:szCs w:val="18"/>
+        </w:rPr>
       </w:pPr>
       <w:r>
         <w:rPr>
+          <w:rFonts w:ascii="Arial" w:hAnsi="Arial" w:cs="Arial"/>
           <w:b w:val="1"/>
           <w:bCs w:val="1"/>
+          <w:sz w:val="18"/>
+          <w:szCs w:val="18"/>
         </w:rPr>
         <w:t>Security and Quality:</w:t>
       </w:r>
       <w:r>
+        <w:rPr>
+          <w:rFonts w:ascii="Arial" w:hAnsi="Arial" w:cs="Arial"/>
+          <w:sz w:val="18"/>
+          <w:szCs w:val="18"/>
+        </w:rPr>
         <w:t xml:space="preserve"> MSAL single sign-on, role-based access control, form validation, WCAG 2.1 AA accessibility, performance optimization, localization</w:t>
       </w:r>
     </w:p>
@@ -526,21 +643,45 @@
           <w:ilvl w:val="0"/>
           <w:numId w:val="37"/>
         </w:numPr>
-        <w:spacing w:before="0" w:after="0"/>
+        <w:spacing w:before="0" w:after="0" w:beforeAutospacing="0" w:afterAutospacing="0"/>
         <w:ind w:hanging="360" w:left="720" w:right="0"/>
+        <w:rPr>
+          <w:rFonts w:ascii="Arial" w:hAnsi="Arial" w:cs="Arial"/>
+          <w:sz w:val="18"/>
+          <w:szCs w:val="18"/>
+        </w:rPr>
       </w:pPr>
       <w:r>
         <w:rPr>
+          <w:rFonts w:ascii="Arial" w:hAnsi="Arial" w:cs="Arial"/>
           <w:b w:val="1"/>
           <w:bCs w:val="1"/>
+          <w:sz w:val="18"/>
+          <w:szCs w:val="18"/>
         </w:rPr>
         <w:t>Ways of Working:</w:t>
       </w:r>
       <w:r>
+        <w:rPr>
+          <w:rFonts w:ascii="Arial" w:hAnsi="Arial" w:cs="Arial"/>
+          <w:sz w:val="18"/>
+          <w:szCs w:val="18"/>
+        </w:rPr>
         <w:t xml:space="preserve"> Consulting and client-facing delivery, Agile, Scrum, requirement gathering, estimation, code reviews, Jira, VS Code, Visual Studio</w:t>
       </w:r>
       <w:bookmarkStart w:id="5" w:name="_dx_frag_EndFragment"/>
       <w:bookmarkEnd w:id="5"/>
+    </w:p>
+    <w:p>
+      <w:pPr>
+        <w:spacing w:before="0" w:after="0" w:beforeAutospacing="0" w:afterAutospacing="0"/>
+        <w:ind w:firstLine="0" w:left="720" w:right="0"/>
+        <w:rPr>
+          <w:rFonts w:ascii="Arial" w:hAnsi="Arial" w:cs="Arial"/>
+          <w:sz w:val="18"/>
+          <w:szCs w:val="18"/>
+        </w:rPr>
+      </w:pPr>
     </w:p>
     <w:p>
       <w:pPr>
@@ -555,6 +696,8 @@
         <w:rPr>
           <w:rFonts w:ascii="Arial" w:hAnsi="Arial" w:cs="Arial"/>
           <w:color w:val="446EA2"/>
+          <w:sz w:val="18"/>
+          <w:szCs w:val="18"/>
         </w:rPr>
       </w:pPr>
       <w:r>
@@ -562,7 +705,8 @@
           <w:rFonts w:ascii="Arial" w:hAnsi="Arial" w:cs="Arial"/>
           <w:b w:val="1"/>
           <w:color w:val="446EA2"/>
-          <w:sz w:val="21"/>
+          <w:sz w:val="18"/>
+          <w:szCs w:val="18"/>
         </w:rPr>
         <w:t>PROFESSIONAL EXPERIENCE</w:t>
       </w:r>
@@ -573,6 +717,8 @@
         <w:rPr>
           <w:rFonts w:ascii="Arial" w:hAnsi="Arial" w:cs="Arial"/>
           <w:color w:val="CA6919"/>
+          <w:sz w:val="18"/>
+          <w:szCs w:val="18"/>
         </w:rPr>
       </w:pPr>
       <w:r>
@@ -580,7 +726,8 @@
           <w:rFonts w:ascii="Arial" w:hAnsi="Arial" w:cs="Arial"/>
           <w:b w:val="1"/>
           <w:color w:val="872600"/>
-          <w:sz w:val="20"/>
+          <w:sz w:val="18"/>
+          <w:szCs w:val="18"/>
         </w:rPr>
         <w:t>Senior Associate Consultant</w:t>
       </w:r>
@@ -589,7 +736,8 @@
           <w:rFonts w:ascii="Arial" w:hAnsi="Arial" w:cs="Arial"/>
           <w:b w:val="1"/>
           <w:color w:val="872600"/>
-          <w:sz w:val="20"/>
+          <w:sz w:val="18"/>
+          <w:szCs w:val="18"/>
           <w:rtl w:val="0"/>
           <w:lang w:val="en-IN" w:bidi="en-IN" w:eastAsia="en-IN"/>
         </w:rPr>
@@ -600,7 +748,8 @@
           <w:rFonts w:ascii="Arial" w:hAnsi="Arial" w:cs="Arial"/>
           <w:b w:val="1"/>
           <w:color w:val="CA6919"/>
-          <w:sz w:val="20"/>
+          <w:sz w:val="18"/>
+          <w:szCs w:val="18"/>
         </w:rPr>
         <w:t xml:space="preserve"> | Infosys</w:t>
       </w:r>
@@ -609,6 +758,8 @@
           <w:rFonts w:ascii="Arial" w:hAnsi="Arial" w:cs="Arial"/>
           <w:i w:val="1"/>
           <w:color w:val="CA6919"/>
+          <w:sz w:val="18"/>
+          <w:szCs w:val="18"/>
         </w:rPr>
         <w:t xml:space="preserve">  •  Mississauga, ON, Canada  |  </w:t>
       </w:r>
@@ -617,6 +768,8 @@
           <w:rFonts w:ascii="Arial" w:hAnsi="Arial" w:cs="Arial"/>
           <w:i w:val="1"/>
           <w:color w:val="CA6919"/>
+          <w:sz w:val="18"/>
+          <w:szCs w:val="18"/>
           <w:rtl w:val="0"/>
           <w:lang w:val="en-IN" w:bidi="en-IN" w:eastAsia="en-IN"/>
         </w:rPr>
@@ -627,6 +780,8 @@
           <w:rFonts w:ascii="Arial" w:hAnsi="Arial" w:cs="Arial"/>
           <w:i w:val="1"/>
           <w:color w:val="CA6919"/>
+          <w:sz w:val="18"/>
+          <w:szCs w:val="18"/>
         </w:rPr>
         <w:t xml:space="preserve">2023 – </w:t>
       </w:r>
@@ -635,6 +790,8 @@
           <w:rFonts w:ascii="Arial" w:hAnsi="Arial" w:cs="Arial"/>
           <w:i w:val="1"/>
           <w:color w:val="CA6919"/>
+          <w:sz w:val="18"/>
+          <w:szCs w:val="18"/>
           <w:rtl w:val="0"/>
           <w:lang w:val="en-IN" w:bidi="en-IN" w:eastAsia="en-IN"/>
         </w:rPr>
@@ -647,6 +804,8 @@
         <w:rPr>
           <w:rFonts w:ascii="Arial" w:hAnsi="Arial" w:cs="Arial"/>
           <w:color w:val="CA6919"/>
+          <w:sz w:val="18"/>
+          <w:szCs w:val="18"/>
         </w:rPr>
       </w:pPr>
       <w:r>
@@ -655,6 +814,7 @@
           <w:b w:val="1"/>
           <w:color w:val="CA6919"/>
           <w:sz w:val="18"/>
+          <w:szCs w:val="18"/>
         </w:rPr>
         <w:t>Client: Microsoft</w:t>
       </w:r>
@@ -665,6 +825,8 @@
         <w:ind w:firstLine="0" w:left="0" w:right="0"/>
         <w:rPr>
           <w:rFonts w:ascii="Arial" w:hAnsi="Arial" w:cs="Arial"/>
+          <w:sz w:val="18"/>
+          <w:szCs w:val="18"/>
         </w:rPr>
       </w:pPr>
       <w:bookmarkStart w:id="6" w:name="_dx_frag_StartFragment"/>
@@ -673,17 +835,19 @@
       <w:bookmarkEnd w:id="7"/>
       <w:bookmarkStart w:id="8" w:name="_dx_frag_StartFragment"/>
       <w:bookmarkEnd w:id="8"/>
-      <w:bookmarkStart w:id="9" w:name="_dx_frag_EndFragment"/>
+      <w:bookmarkStart w:id="9" w:name="_dx_frag_StartFragment"/>
       <w:bookmarkEnd w:id="9"/>
       <w:bookmarkStart w:id="10" w:name="_dx_frag_EndFragment"/>
       <w:bookmarkEnd w:id="10"/>
-      <w:bookmarkStart w:id="11" w:name="_dx_frag_StartFragment"/>
+      <w:bookmarkStart w:id="11" w:name="_dx_frag_EndFragment"/>
       <w:bookmarkEnd w:id="11"/>
       <w:r>
         <w:rPr>
           <w:rFonts w:ascii="Arial" w:hAnsi="Arial" w:cs="Arial"/>
           <w:b w:val="1"/>
           <w:bCs w:val="1"/>
+          <w:sz w:val="18"/>
+          <w:szCs w:val="18"/>
         </w:rPr>
         <w:t>Microsoft Finance Platform (React, Redux, TypeScript)</w:t>
       </w:r>
@@ -698,11 +862,15 @@
         <w:ind w:hanging="360" w:left="720" w:right="0"/>
         <w:rPr>
           <w:rFonts w:ascii="Arial" w:hAnsi="Arial" w:cs="Arial"/>
+          <w:sz w:val="18"/>
+          <w:szCs w:val="18"/>
         </w:rPr>
       </w:pPr>
       <w:r>
         <w:rPr>
           <w:rFonts w:ascii="Arial" w:hAnsi="Arial" w:cs="Arial"/>
+          <w:sz w:val="18"/>
+          <w:szCs w:val="18"/>
         </w:rPr>
         <w:t>Built a responsive React app with Hooks and Fluent UI to manage expense-allocation rules and large financial datasets.</w:t>
       </w:r>
@@ -717,11 +885,15 @@
         <w:ind w:hanging="360" w:left="720" w:right="0"/>
         <w:rPr>
           <w:rFonts w:ascii="Arial" w:hAnsi="Arial" w:cs="Arial"/>
+          <w:sz w:val="18"/>
+          <w:szCs w:val="18"/>
         </w:rPr>
       </w:pPr>
       <w:r>
         <w:rPr>
           <w:rFonts w:ascii="Arial" w:hAnsi="Arial" w:cs="Arial"/>
+          <w:sz w:val="18"/>
+          <w:szCs w:val="18"/>
         </w:rPr>
         <w:t>Connected React components to REST APIs and Azure SQL to handle high volumes of transaction data.</w:t>
       </w:r>
@@ -736,11 +908,15 @@
         <w:ind w:hanging="360" w:left="720" w:right="0"/>
         <w:rPr>
           <w:rFonts w:ascii="Arial" w:hAnsi="Arial" w:cs="Arial"/>
+          <w:sz w:val="18"/>
+          <w:szCs w:val="18"/>
         </w:rPr>
       </w:pPr>
       <w:r>
         <w:rPr>
           <w:rFonts w:ascii="Arial" w:hAnsi="Arial" w:cs="Arial"/>
+          <w:sz w:val="18"/>
+          <w:szCs w:val="18"/>
         </w:rPr>
         <w:t>Built the homepage, rule setup screens and questionnaire forms, with editable grids and multi-level validation on the client side.</w:t>
       </w:r>
@@ -755,11 +931,15 @@
         <w:ind w:hanging="360" w:left="720" w:right="0"/>
         <w:rPr>
           <w:rFonts w:ascii="Arial" w:hAnsi="Arial" w:cs="Arial"/>
+          <w:sz w:val="18"/>
+          <w:szCs w:val="18"/>
         </w:rPr>
       </w:pPr>
       <w:r>
         <w:rPr>
           <w:rFonts w:ascii="Arial" w:hAnsi="Arial" w:cs="Arial"/>
+          <w:sz w:val="18"/>
+          <w:szCs w:val="18"/>
         </w:rPr>
         <w:t>Set up Redux state management so large datasets load and render quickly.</w:t>
       </w:r>
@@ -774,11 +954,15 @@
         <w:ind w:hanging="360" w:left="720" w:right="0"/>
         <w:rPr>
           <w:rFonts w:ascii="Arial" w:hAnsi="Arial" w:cs="Arial"/>
+          <w:sz w:val="18"/>
+          <w:szCs w:val="18"/>
         </w:rPr>
       </w:pPr>
       <w:r>
         <w:rPr>
           <w:rFonts w:ascii="Arial" w:hAnsi="Arial" w:cs="Arial"/>
+          <w:sz w:val="18"/>
+          <w:szCs w:val="18"/>
         </w:rPr>
         <w:t>Added single sign-on with Microsoft Authentication Library (MSAL), including token handling, route guards and role-based access.</w:t>
       </w:r>
@@ -793,11 +977,15 @@
         <w:ind w:hanging="360" w:left="720" w:right="0"/>
         <w:rPr>
           <w:rFonts w:ascii="Arial" w:hAnsi="Arial" w:cs="Arial"/>
+          <w:sz w:val="18"/>
+          <w:szCs w:val="18"/>
         </w:rPr>
       </w:pPr>
       <w:r>
         <w:rPr>
           <w:rFonts w:ascii="Arial" w:hAnsi="Arial" w:cs="Arial"/>
+          <w:sz w:val="18"/>
+          <w:szCs w:val="18"/>
         </w:rPr>
         <w:t>Wrote unit and integration tests with React Testing Library and end-to-end tests with Cypress, so releases were safer.</w:t>
       </w:r>
@@ -808,6 +996,8 @@
         <w:ind w:firstLine="0" w:left="0" w:right="0"/>
         <w:rPr>
           <w:rFonts w:ascii="Arial" w:hAnsi="Arial" w:cs="Arial"/>
+          <w:sz w:val="18"/>
+          <w:szCs w:val="18"/>
         </w:rPr>
       </w:pPr>
       <w:r>
@@ -815,6 +1005,8 @@
           <w:rFonts w:ascii="Arial" w:hAnsi="Arial" w:cs="Arial"/>
           <w:b w:val="1"/>
           <w:bCs w:val="1"/>
+          <w:sz w:val="18"/>
+          <w:szCs w:val="18"/>
         </w:rPr>
         <w:t>Microsoft Vetting Platform (Angular, TypeScript)</w:t>
       </w:r>
@@ -829,11 +1021,15 @@
         <w:ind w:hanging="360" w:left="720" w:right="0"/>
         <w:rPr>
           <w:rFonts w:ascii="Arial" w:hAnsi="Arial" w:cs="Arial"/>
+          <w:sz w:val="18"/>
+          <w:szCs w:val="18"/>
         </w:rPr>
       </w:pPr>
       <w:r>
         <w:rPr>
           <w:rFonts w:ascii="Arial" w:hAnsi="Arial" w:cs="Arial"/>
+          <w:sz w:val="18"/>
+          <w:szCs w:val="18"/>
         </w:rPr>
         <w:t>Built enterprise Angular (v12+) modules in TypeScript with reusable components.</w:t>
       </w:r>
@@ -848,11 +1044,15 @@
         <w:ind w:hanging="360" w:left="720" w:right="0"/>
         <w:rPr>
           <w:rFonts w:ascii="Arial" w:hAnsi="Arial" w:cs="Arial"/>
+          <w:sz w:val="18"/>
+          <w:szCs w:val="18"/>
         </w:rPr>
       </w:pPr>
       <w:r>
         <w:rPr>
           <w:rFonts w:ascii="Arial" w:hAnsi="Arial" w:cs="Arial"/>
+          <w:sz w:val="18"/>
+          <w:szCs w:val="18"/>
         </w:rPr>
         <w:t>Used RxJS Observables and BehaviorSubjects to keep the UI responsive under heavy load.</w:t>
       </w:r>
@@ -867,11 +1067,15 @@
         <w:ind w:hanging="360" w:left="720" w:right="0"/>
         <w:rPr>
           <w:rFonts w:ascii="Arial" w:hAnsi="Arial" w:cs="Arial"/>
+          <w:sz w:val="18"/>
+          <w:szCs w:val="18"/>
         </w:rPr>
       </w:pPr>
       <w:r>
         <w:rPr>
           <w:rFonts w:ascii="Arial" w:hAnsi="Arial" w:cs="Arial"/>
+          <w:sz w:val="18"/>
+          <w:szCs w:val="18"/>
         </w:rPr>
         <w:t>Built user-access validation, access-review grids, data forms and admin tracking dashboards.</w:t>
       </w:r>
@@ -886,11 +1090,15 @@
         <w:ind w:hanging="360" w:left="720" w:right="0"/>
         <w:rPr>
           <w:rFonts w:ascii="Arial" w:hAnsi="Arial" w:cs="Arial"/>
+          <w:sz w:val="18"/>
+          <w:szCs w:val="18"/>
         </w:rPr>
       </w:pPr>
       <w:r>
         <w:rPr>
           <w:rFonts w:ascii="Arial" w:hAnsi="Arial" w:cs="Arial"/>
+          <w:sz w:val="18"/>
+          <w:szCs w:val="18"/>
         </w:rPr>
         <w:t>Added search, filtering, sorting and pagination using shared REST API services.</w:t>
       </w:r>
@@ -905,11 +1113,15 @@
         <w:ind w:hanging="360" w:left="720" w:right="0"/>
         <w:rPr>
           <w:rFonts w:ascii="Arial" w:hAnsi="Arial" w:cs="Arial"/>
+          <w:sz w:val="18"/>
+          <w:szCs w:val="18"/>
         </w:rPr>
       </w:pPr>
       <w:r>
         <w:rPr>
           <w:rFonts w:ascii="Arial" w:hAnsi="Arial" w:cs="Arial"/>
+          <w:sz w:val="18"/>
+          <w:szCs w:val="18"/>
         </w:rPr>
         <w:t>Met WCAG 2.1 AA through keyboard navigation and screen-reader fixes.</w:t>
       </w:r>
@@ -924,11 +1136,15 @@
         <w:ind w:hanging="360" w:left="720" w:right="0"/>
         <w:rPr>
           <w:rFonts w:ascii="Arial" w:hAnsi="Arial" w:cs="Arial"/>
+          <w:sz w:val="18"/>
+          <w:szCs w:val="18"/>
         </w:rPr>
       </w:pPr>
       <w:r>
         <w:rPr>
           <w:rFonts w:ascii="Arial" w:hAnsi="Arial" w:cs="Arial"/>
+          <w:sz w:val="18"/>
+          <w:szCs w:val="18"/>
         </w:rPr>
         <w:t>Maintained Jasmine and Karma unit tests and Playwright end-to-end regression tests.</w:t>
       </w:r>
@@ -943,11 +1159,15 @@
         <w:ind w:hanging="360" w:left="720" w:right="0"/>
         <w:rPr>
           <w:rFonts w:ascii="Arial" w:hAnsi="Arial" w:cs="Arial"/>
+          <w:sz w:val="18"/>
+          <w:szCs w:val="18"/>
         </w:rPr>
       </w:pPr>
       <w:r>
         <w:rPr>
           <w:rFonts w:ascii="Arial" w:hAnsi="Arial" w:cs="Arial"/>
+          <w:sz w:val="18"/>
+          <w:szCs w:val="18"/>
         </w:rPr>
         <w:t>Led the team's move to GitHub Copilot, set code-review standards for it, and built a proof-of-concept tool for testing API schemas, released through Azure DevOps Pipelines.</w:t>
       </w:r>
@@ -962,11 +1182,15 @@
         <w:ind w:hanging="360" w:left="720" w:right="0"/>
         <w:rPr>
           <w:rFonts w:ascii="Arial" w:hAnsi="Arial" w:cs="Arial"/>
+          <w:sz w:val="18"/>
+          <w:szCs w:val="18"/>
         </w:rPr>
       </w:pPr>
       <w:r>
         <w:rPr>
           <w:rFonts w:ascii="Arial" w:hAnsi="Arial" w:cs="Arial"/>
+          <w:sz w:val="18"/>
+          <w:szCs w:val="18"/>
         </w:rPr>
         <w:t>Helped build reusable components that improved development efficiency by 30%.</w:t>
       </w:r>
@@ -980,6 +1204,8 @@
         <w:rPr>
           <w:rFonts w:ascii="Arial" w:hAnsi="Arial" w:cs="Arial" w:eastAsia="Google Sans"/>
           <w:b w:val="0"/>
+          <w:sz w:val="18"/>
+          <w:szCs w:val="18"/>
           <w:u w:val="none"/>
         </w:rPr>
       </w:pPr>
@@ -990,6 +1216,8 @@
         <w:ind w:hanging="173" w:left="259"/>
         <w:rPr>
           <w:rFonts w:ascii="Arial" w:hAnsi="Arial" w:cs="Arial"/>
+          <w:sz w:val="18"/>
+          <w:szCs w:val="18"/>
         </w:rPr>
       </w:pPr>
       <w:bookmarkStart w:id="13" w:name="_dx_frag_EndFragment"/>
@@ -1001,6 +1229,8 @@
         <w:rPr>
           <w:rFonts w:ascii="Arial" w:hAnsi="Arial" w:cs="Arial"/>
           <w:color w:val="CA6919"/>
+          <w:sz w:val="18"/>
+          <w:szCs w:val="18"/>
         </w:rPr>
       </w:pPr>
       <w:r>
@@ -1008,7 +1238,8 @@
           <w:rFonts w:ascii="Arial" w:hAnsi="Arial" w:cs="Arial"/>
           <w:b w:val="1"/>
           <w:color w:val="872600"/>
-          <w:sz w:val="20"/>
+          <w:sz w:val="18"/>
+          <w:szCs w:val="18"/>
         </w:rPr>
         <w:t>Associate Consultant | Infosys</w:t>
       </w:r>
@@ -1017,6 +1248,8 @@
           <w:rFonts w:ascii="Arial" w:hAnsi="Arial" w:cs="Arial"/>
           <w:i w:val="1"/>
           <w:color w:val="872600"/>
+          <w:sz w:val="18"/>
+          <w:szCs w:val="18"/>
         </w:rPr>
         <w:t xml:space="preserve">  </w:t>
       </w:r>
@@ -1025,6 +1258,8 @@
           <w:rFonts w:ascii="Arial" w:hAnsi="Arial" w:cs="Arial"/>
           <w:i w:val="1"/>
           <w:color w:val="CA6919"/>
+          <w:sz w:val="18"/>
+          <w:szCs w:val="18"/>
         </w:rPr>
         <w:t xml:space="preserve">•  Mississauga, ON, Canada  |  </w:t>
       </w:r>
@@ -1033,6 +1268,8 @@
           <w:rFonts w:ascii="Arial" w:hAnsi="Arial" w:cs="Arial"/>
           <w:i w:val="1"/>
           <w:color w:val="CA6919"/>
+          <w:sz w:val="18"/>
+          <w:szCs w:val="18"/>
           <w:rtl w:val="0"/>
           <w:lang w:val="en-IN" w:bidi="en-IN" w:eastAsia="en-IN"/>
         </w:rPr>
@@ -1043,6 +1280,8 @@
           <w:rFonts w:ascii="Arial" w:hAnsi="Arial" w:cs="Arial"/>
           <w:i w:val="1"/>
           <w:color w:val="CA6919"/>
+          <w:sz w:val="18"/>
+          <w:szCs w:val="18"/>
         </w:rPr>
         <w:t xml:space="preserve">2022 – </w:t>
       </w:r>
@@ -1051,6 +1290,8 @@
           <w:rFonts w:ascii="Arial" w:hAnsi="Arial" w:cs="Arial"/>
           <w:i w:val="1"/>
           <w:color w:val="CA6919"/>
+          <w:sz w:val="18"/>
+          <w:szCs w:val="18"/>
           <w:rtl w:val="0"/>
           <w:lang w:val="en-IN" w:bidi="en-IN" w:eastAsia="en-IN"/>
         </w:rPr>
@@ -1061,6 +1302,8 @@
           <w:rFonts w:ascii="Arial" w:hAnsi="Arial" w:cs="Arial"/>
           <w:i w:val="1"/>
           <w:color w:val="CA6919"/>
+          <w:sz w:val="18"/>
+          <w:szCs w:val="18"/>
         </w:rPr>
         <w:t>2023</w:t>
       </w:r>
@@ -1070,6 +1313,8 @@
         <w:spacing w:after="20" w:beforeAutospacing="0" w:afterAutospacing="0"/>
         <w:rPr>
           <w:rFonts w:ascii="Arial" w:hAnsi="Arial" w:cs="Arial"/>
+          <w:sz w:val="18"/>
+          <w:szCs w:val="18"/>
         </w:rPr>
       </w:pPr>
       <w:r>
@@ -1078,6 +1323,7 @@
           <w:b w:val="1"/>
           <w:color w:val="CA6919"/>
           <w:sz w:val="18"/>
+          <w:szCs w:val="18"/>
         </w:rPr>
         <w:t>Client: Dyno Nobel</w:t>
       </w:r>
@@ -1091,11 +1337,15 @@
         <w:spacing w:after="20" w:beforeAutospacing="0" w:afterAutospacing="0"/>
         <w:rPr>
           <w:rFonts w:ascii="Arial" w:hAnsi="Arial" w:cs="Arial"/>
+          <w:sz w:val="18"/>
+          <w:szCs w:val="18"/>
         </w:rPr>
       </w:pPr>
       <w:r>
         <w:rPr>
           <w:rFonts w:ascii="Arial" w:hAnsi="Arial" w:cs="Arial"/>
+          <w:sz w:val="18"/>
+          <w:szCs w:val="18"/>
         </w:rPr>
         <w:t xml:space="preserve">Implemented CSV upload and API integration functionality and developed user interfaces using </w:t>
       </w:r>
@@ -1104,12 +1354,16 @@
           <w:rFonts w:ascii="Arial" w:hAnsi="Arial" w:cs="Arial"/>
           <w:b w:val="1"/>
           <w:bCs w:val="1"/>
+          <w:sz w:val="18"/>
+          <w:szCs w:val="18"/>
         </w:rPr>
         <w:t>Material UI</w:t>
       </w:r>
       <w:r>
         <w:rPr>
           <w:rFonts w:ascii="Arial" w:hAnsi="Arial" w:cs="Arial"/>
+          <w:sz w:val="18"/>
+          <w:szCs w:val="18"/>
         </w:rPr>
         <w:t xml:space="preserve">, including modals, alerts and sliders. </w:t>
       </w:r>
@@ -1123,11 +1377,15 @@
         <w:spacing w:after="20" w:beforeAutospacing="0" w:afterAutospacing="0"/>
         <w:rPr>
           <w:rFonts w:ascii="Arial" w:hAnsi="Arial" w:cs="Arial"/>
+          <w:sz w:val="18"/>
+          <w:szCs w:val="18"/>
         </w:rPr>
       </w:pPr>
       <w:r>
         <w:rPr>
           <w:rFonts w:ascii="Arial" w:hAnsi="Arial" w:cs="Arial"/>
+          <w:sz w:val="18"/>
+          <w:szCs w:val="18"/>
         </w:rPr>
         <w:t>Worked on the Vibrations feature, implementing CSV upload, REST API integration and user-interface functionality using Material UI.</w:t>
       </w:r>
@@ -1141,11 +1399,15 @@
         <w:spacing w:after="20" w:beforeAutospacing="0" w:afterAutospacing="0"/>
         <w:rPr>
           <w:rFonts w:ascii="Arial" w:hAnsi="Arial" w:cs="Arial"/>
+          <w:sz w:val="18"/>
+          <w:szCs w:val="18"/>
         </w:rPr>
       </w:pPr>
       <w:r>
         <w:rPr>
           <w:rFonts w:ascii="Arial" w:hAnsi="Arial" w:cs="Arial"/>
+          <w:sz w:val="18"/>
+          <w:szCs w:val="18"/>
         </w:rPr>
         <w:t xml:space="preserve">Developed unit tests using </w:t>
       </w:r>
@@ -1154,12 +1416,16 @@
           <w:rFonts w:ascii="Arial" w:hAnsi="Arial" w:cs="Arial"/>
           <w:b w:val="1"/>
           <w:bCs w:val="1"/>
+          <w:sz w:val="18"/>
+          <w:szCs w:val="18"/>
         </w:rPr>
         <w:t>React Testing Library</w:t>
       </w:r>
       <w:r>
         <w:rPr>
           <w:rFonts w:ascii="Arial" w:hAnsi="Arial" w:cs="Arial"/>
+          <w:sz w:val="18"/>
+          <w:szCs w:val="18"/>
         </w:rPr>
         <w:t>.</w:t>
       </w:r>
@@ -1169,6 +1435,8 @@
         <w:spacing w:after="20" w:beforeAutospacing="0" w:afterAutospacing="0"/>
         <w:rPr>
           <w:rFonts w:ascii="Arial" w:hAnsi="Arial" w:cs="Arial"/>
+          <w:sz w:val="18"/>
+          <w:szCs w:val="18"/>
         </w:rPr>
       </w:pPr>
     </w:p>
@@ -1178,6 +1446,8 @@
         <w:rPr>
           <w:rFonts w:ascii="Arial" w:hAnsi="Arial" w:cs="Arial"/>
           <w:color w:val="CA6919"/>
+          <w:sz w:val="18"/>
+          <w:szCs w:val="18"/>
         </w:rPr>
       </w:pPr>
       <w:r>
@@ -1186,6 +1456,7 @@
           <w:b w:val="1"/>
           <w:color w:val="CA6919"/>
           <w:sz w:val="18"/>
+          <w:szCs w:val="18"/>
         </w:rPr>
         <w:t>Client: Avery Dennison</w:t>
       </w:r>
@@ -1199,11 +1470,15 @@
         <w:spacing w:after="30" w:beforeAutospacing="0" w:afterAutospacing="0"/>
         <w:rPr>
           <w:rFonts w:ascii="Arial" w:hAnsi="Arial" w:cs="Arial"/>
+          <w:sz w:val="18"/>
+          <w:szCs w:val="18"/>
         </w:rPr>
       </w:pPr>
       <w:r>
         <w:rPr>
           <w:rFonts w:ascii="Arial" w:hAnsi="Arial" w:cs="Arial"/>
+          <w:sz w:val="18"/>
+          <w:szCs w:val="18"/>
         </w:rPr>
         <w:t>Designed reusable custom text inputs and dropdown components and implemented language translation/localization.</w:t>
       </w:r>
@@ -1217,17 +1492,23 @@
         <w:spacing w:after="30" w:beforeAutospacing="0" w:afterAutospacing="0"/>
         <w:rPr>
           <w:rFonts w:ascii="Arial" w:hAnsi="Arial" w:cs="Arial"/>
+          <w:sz w:val="18"/>
+          <w:szCs w:val="18"/>
         </w:rPr>
       </w:pPr>
       <w:r>
         <w:rPr>
           <w:rFonts w:ascii="Arial" w:hAnsi="Arial" w:cs="Arial"/>
+          <w:sz w:val="18"/>
+          <w:szCs w:val="18"/>
         </w:rPr>
         <w:t>Developed UI</w:t>
       </w:r>
       <w:r>
         <w:rPr>
           <w:rFonts w:ascii="Arial" w:hAnsi="Arial" w:cs="Arial"/>
+          <w:sz w:val="18"/>
+          <w:szCs w:val="18"/>
           <w:rtl w:val="0"/>
           <w:lang w:val="en-IN" w:bidi="en-IN" w:eastAsia="en-IN"/>
         </w:rPr>
@@ -1238,6 +1519,8 @@
           <w:rFonts w:ascii="Arial" w:hAnsi="Arial" w:cs="Arial"/>
           <w:b w:val="1"/>
           <w:bCs w:val="1"/>
+          <w:sz w:val="18"/>
+          <w:szCs w:val="18"/>
           <w:rtl w:val="0"/>
           <w:lang w:val="en-IN" w:bidi="en-IN" w:eastAsia="en-IN"/>
         </w:rPr>
@@ -1246,6 +1529,8 @@
       <w:r>
         <w:rPr>
           <w:rFonts w:ascii="Arial" w:hAnsi="Arial" w:cs="Arial"/>
+          <w:sz w:val="18"/>
+          <w:szCs w:val="18"/>
         </w:rPr>
         <w:t xml:space="preserve"> for return assessment, scan history and terms-and-conditions experiences, with API integration.</w:t>
       </w:r>
@@ -1256,6 +1541,8 @@
         <w:ind w:hanging="173" w:left="259"/>
         <w:rPr>
           <w:rFonts w:ascii="Arial" w:hAnsi="Arial" w:cs="Arial"/>
+          <w:sz w:val="18"/>
+          <w:szCs w:val="18"/>
         </w:rPr>
       </w:pPr>
     </w:p>
@@ -1265,6 +1552,8 @@
         <w:rPr>
           <w:rFonts w:ascii="Arial" w:hAnsi="Arial" w:cs="Arial"/>
           <w:color w:val="CA6919"/>
+          <w:sz w:val="18"/>
+          <w:szCs w:val="18"/>
         </w:rPr>
       </w:pPr>
       <w:r>
@@ -1272,7 +1561,8 @@
           <w:rFonts w:ascii="Arial" w:hAnsi="Arial" w:cs="Arial"/>
           <w:b w:val="1"/>
           <w:color w:val="872600"/>
-          <w:sz w:val="20"/>
+          <w:sz w:val="18"/>
+          <w:szCs w:val="18"/>
         </w:rPr>
         <w:t>Associate Consultant | Infosys</w:t>
       </w:r>
@@ -1281,6 +1571,8 @@
           <w:rFonts w:ascii="Arial" w:hAnsi="Arial" w:cs="Arial"/>
           <w:i w:val="1"/>
           <w:color w:val="872600"/>
+          <w:sz w:val="18"/>
+          <w:szCs w:val="18"/>
         </w:rPr>
         <w:t xml:space="preserve"> </w:t>
       </w:r>
@@ -1289,6 +1581,8 @@
           <w:rFonts w:ascii="Arial" w:hAnsi="Arial" w:cs="Arial"/>
           <w:i w:val="1"/>
           <w:color w:val="CA6919"/>
+          <w:sz w:val="18"/>
+          <w:szCs w:val="18"/>
         </w:rPr>
         <w:t xml:space="preserve"> •  Mangalore, India  |  </w:t>
       </w:r>
@@ -1297,6 +1591,8 @@
           <w:rFonts w:ascii="Arial" w:hAnsi="Arial" w:cs="Arial"/>
           <w:i w:val="1"/>
           <w:color w:val="CA6919"/>
+          <w:sz w:val="18"/>
+          <w:szCs w:val="18"/>
           <w:rtl w:val="0"/>
           <w:lang w:val="en-IN" w:bidi="en-IN" w:eastAsia="en-IN"/>
         </w:rPr>
@@ -1307,6 +1603,8 @@
           <w:rFonts w:ascii="Arial" w:hAnsi="Arial" w:cs="Arial"/>
           <w:i w:val="1"/>
           <w:color w:val="CA6919"/>
+          <w:sz w:val="18"/>
+          <w:szCs w:val="18"/>
         </w:rPr>
         <w:t xml:space="preserve">2021 – </w:t>
       </w:r>
@@ -1315,6 +1613,8 @@
           <w:rFonts w:ascii="Arial" w:hAnsi="Arial" w:cs="Arial"/>
           <w:i w:val="1"/>
           <w:color w:val="CA6919"/>
+          <w:sz w:val="18"/>
+          <w:szCs w:val="18"/>
           <w:rtl w:val="0"/>
           <w:lang w:val="en-IN" w:bidi="en-IN" w:eastAsia="en-IN"/>
         </w:rPr>
@@ -1325,6 +1625,8 @@
           <w:rFonts w:ascii="Arial" w:hAnsi="Arial" w:cs="Arial"/>
           <w:i w:val="1"/>
           <w:color w:val="CA6919"/>
+          <w:sz w:val="18"/>
+          <w:szCs w:val="18"/>
         </w:rPr>
         <w:t>2022</w:t>
       </w:r>
@@ -1335,6 +1637,8 @@
         <w:rPr>
           <w:rFonts w:ascii="Arial" w:hAnsi="Arial" w:cs="Arial"/>
           <w:color w:val="CA6919"/>
+          <w:sz w:val="18"/>
+          <w:szCs w:val="18"/>
         </w:rPr>
       </w:pPr>
       <w:r>
@@ -1343,6 +1647,7 @@
           <w:b w:val="1"/>
           <w:color w:val="CA6919"/>
           <w:sz w:val="18"/>
+          <w:szCs w:val="18"/>
         </w:rPr>
         <w:t>Client: Johnson Controls International</w:t>
       </w:r>
@@ -1356,11 +1661,15 @@
         <w:spacing w:after="20" w:beforeAutospacing="0" w:afterAutospacing="0"/>
         <w:rPr>
           <w:rFonts w:ascii="Arial" w:hAnsi="Arial" w:cs="Arial"/>
+          <w:sz w:val="18"/>
+          <w:szCs w:val="18"/>
         </w:rPr>
       </w:pPr>
       <w:r>
         <w:rPr>
           <w:rFonts w:ascii="Arial" w:hAnsi="Arial" w:cs="Arial"/>
+          <w:sz w:val="18"/>
+          <w:szCs w:val="18"/>
         </w:rPr>
         <w:t>Developed and optimized features for the Selection Navigator mobile application for a global diversified technology and multi-industrial organization.</w:t>
       </w:r>
@@ -1374,11 +1683,15 @@
         <w:spacing w:after="20" w:beforeAutospacing="0" w:afterAutospacing="0"/>
         <w:rPr>
           <w:rFonts w:ascii="Arial" w:hAnsi="Arial" w:cs="Arial"/>
+          <w:sz w:val="18"/>
+          <w:szCs w:val="18"/>
         </w:rPr>
       </w:pPr>
       <w:r>
         <w:rPr>
           <w:rFonts w:ascii="Arial" w:hAnsi="Arial" w:cs="Arial"/>
+          <w:sz w:val="18"/>
+          <w:szCs w:val="18"/>
         </w:rPr>
         <w:t>Implemented secure login/onboarding experiences using fingerprint, Face ID and MPIN authentication.</w:t>
       </w:r>
@@ -1392,11 +1705,15 @@
         <w:spacing w:after="20" w:beforeAutospacing="0" w:afterAutospacing="0"/>
         <w:rPr>
           <w:rFonts w:ascii="Arial" w:hAnsi="Arial" w:cs="Arial"/>
+          <w:sz w:val="18"/>
+          <w:szCs w:val="18"/>
         </w:rPr>
       </w:pPr>
       <w:r>
         <w:rPr>
           <w:rFonts w:ascii="Arial" w:hAnsi="Arial" w:cs="Arial"/>
+          <w:sz w:val="18"/>
+          <w:szCs w:val="18"/>
         </w:rPr>
         <w:t>Developed interactive frontend components including localized date pickers and scheduling controls.</w:t>
       </w:r>
@@ -1407,6 +1724,8 @@
         <w:ind w:hanging="173" w:left="259"/>
         <w:rPr>
           <w:rFonts w:ascii="Arial" w:hAnsi="Arial" w:cs="Arial"/>
+          <w:sz w:val="18"/>
+          <w:szCs w:val="18"/>
         </w:rPr>
       </w:pPr>
     </w:p>
@@ -1416,6 +1735,8 @@
         <w:rPr>
           <w:rFonts w:ascii="Arial" w:hAnsi="Arial" w:cs="Arial"/>
           <w:color w:val="CA6919"/>
+          <w:sz w:val="18"/>
+          <w:szCs w:val="18"/>
         </w:rPr>
       </w:pPr>
       <w:r>
@@ -1423,7 +1744,8 @@
           <w:rFonts w:ascii="Arial" w:hAnsi="Arial" w:cs="Arial"/>
           <w:b w:val="1"/>
           <w:color w:val="872600"/>
-          <w:sz w:val="20"/>
+          <w:sz w:val="18"/>
+          <w:szCs w:val="18"/>
         </w:rPr>
         <w:t>Associate Interactive Developer | Echidna</w:t>
       </w:r>
@@ -1432,6 +1754,8 @@
           <w:rFonts w:ascii="Arial" w:hAnsi="Arial" w:cs="Arial"/>
           <w:i w:val="1"/>
           <w:color w:val="872600"/>
+          <w:sz w:val="18"/>
+          <w:szCs w:val="18"/>
         </w:rPr>
         <w:t xml:space="preserve"> </w:t>
       </w:r>
@@ -1440,6 +1764,8 @@
           <w:rFonts w:ascii="Arial" w:hAnsi="Arial" w:cs="Arial"/>
           <w:i w:val="1"/>
           <w:color w:val="CA6919"/>
+          <w:sz w:val="18"/>
+          <w:szCs w:val="18"/>
         </w:rPr>
         <w:t xml:space="preserve"> •  Bangalore, India  |  </w:t>
       </w:r>
@@ -1448,6 +1774,8 @@
           <w:rFonts w:ascii="Arial" w:hAnsi="Arial" w:cs="Arial"/>
           <w:i w:val="1"/>
           <w:color w:val="CA6919"/>
+          <w:sz w:val="18"/>
+          <w:szCs w:val="18"/>
           <w:rtl w:val="0"/>
           <w:lang w:val="en-IN" w:bidi="en-IN" w:eastAsia="en-IN"/>
         </w:rPr>
@@ -1458,6 +1786,8 @@
           <w:rFonts w:ascii="Arial" w:hAnsi="Arial" w:cs="Arial"/>
           <w:i w:val="1"/>
           <w:color w:val="CA6919"/>
+          <w:sz w:val="18"/>
+          <w:szCs w:val="18"/>
         </w:rPr>
         <w:t xml:space="preserve">2019 – </w:t>
       </w:r>
@@ -1466,6 +1796,8 @@
           <w:rFonts w:ascii="Arial" w:hAnsi="Arial" w:cs="Arial"/>
           <w:i w:val="1"/>
           <w:color w:val="CA6919"/>
+          <w:sz w:val="18"/>
+          <w:szCs w:val="18"/>
           <w:rtl w:val="0"/>
           <w:lang w:val="en-IN" w:bidi="en-IN" w:eastAsia="en-IN"/>
         </w:rPr>
@@ -1476,6 +1808,8 @@
           <w:rFonts w:ascii="Arial" w:hAnsi="Arial" w:cs="Arial"/>
           <w:i w:val="1"/>
           <w:color w:val="CA6919"/>
+          <w:sz w:val="18"/>
+          <w:szCs w:val="18"/>
         </w:rPr>
         <w:t>2021</w:t>
       </w:r>
@@ -1486,6 +1820,8 @@
         <w:rPr>
           <w:rFonts w:ascii="Arial" w:hAnsi="Arial" w:cs="Arial"/>
           <w:color w:val="CA6919"/>
+          <w:sz w:val="18"/>
+          <w:szCs w:val="18"/>
         </w:rPr>
       </w:pPr>
       <w:r>
@@ -1494,6 +1830,7 @@
           <w:b w:val="1"/>
           <w:color w:val="CA6919"/>
           <w:sz w:val="18"/>
+          <w:szCs w:val="18"/>
         </w:rPr>
         <w:t>Client: Wiakum (eCommerce Platform)</w:t>
       </w:r>
@@ -1509,6 +1846,8 @@
           <w:rFonts w:ascii="Arial" w:hAnsi="Arial" w:cs="Arial"/>
           <w:b w:val="0"/>
           <w:bCs w:val="0"/>
+          <w:sz w:val="18"/>
+          <w:szCs w:val="18"/>
         </w:rPr>
       </w:pPr>
       <w:r>
@@ -1516,6 +1855,8 @@
           <w:rFonts w:ascii="Arial" w:hAnsi="Arial" w:cs="Arial"/>
           <w:b w:val="0"/>
           <w:bCs w:val="0"/>
+          <w:sz w:val="18"/>
+          <w:szCs w:val="18"/>
         </w:rPr>
         <w:t xml:space="preserve">Contributed to end-to-end development of an e-commerce platform serving the Kingdom of Saudi Arabia using </w:t>
       </w:r>
@@ -1524,6 +1865,8 @@
           <w:rFonts w:ascii="Arial" w:hAnsi="Arial" w:cs="Arial"/>
           <w:b w:val="1"/>
           <w:bCs w:val="1"/>
+          <w:sz w:val="18"/>
+          <w:szCs w:val="18"/>
         </w:rPr>
         <w:t>React and Redux</w:t>
       </w:r>
@@ -1532,6 +1875,8 @@
           <w:rFonts w:ascii="Arial" w:hAnsi="Arial" w:cs="Arial"/>
           <w:b w:val="0"/>
           <w:bCs w:val="0"/>
+          <w:sz w:val="18"/>
+          <w:szCs w:val="18"/>
         </w:rPr>
         <w:t>, covering the customer-facing shopping experience.</w:t>
       </w:r>
@@ -1547,6 +1892,8 @@
           <w:rFonts w:ascii="Arial" w:hAnsi="Arial" w:cs="Arial"/>
           <w:b w:val="0"/>
           <w:bCs w:val="0"/>
+          <w:sz w:val="18"/>
+          <w:szCs w:val="18"/>
         </w:rPr>
       </w:pPr>
       <w:r>
@@ -1554,6 +1901,8 @@
           <w:rFonts w:ascii="Arial" w:hAnsi="Arial" w:cs="Arial"/>
           <w:b w:val="0"/>
           <w:bCs w:val="0"/>
+          <w:sz w:val="18"/>
+          <w:szCs w:val="18"/>
         </w:rPr>
         <w:t>Implemented login, signup, orders, forgot-password and REST API integration features.</w:t>
       </w:r>
@@ -1565,6 +1914,8 @@
         <w:rPr>
           <w:rFonts w:ascii="Arial" w:hAnsi="Arial" w:cs="Arial"/>
           <w:color w:val="CA6919"/>
+          <w:sz w:val="18"/>
+          <w:szCs w:val="18"/>
         </w:rPr>
       </w:pPr>
     </w:p>
@@ -1574,6 +1925,8 @@
         <w:rPr>
           <w:rFonts w:ascii="Arial" w:hAnsi="Arial" w:cs="Arial"/>
           <w:color w:val="CA6919"/>
+          <w:sz w:val="18"/>
+          <w:szCs w:val="18"/>
         </w:rPr>
       </w:pPr>
       <w:r>
@@ -1582,6 +1935,7 @@
           <w:b w:val="1"/>
           <w:color w:val="CA6919"/>
           <w:sz w:val="18"/>
+          <w:szCs w:val="18"/>
         </w:rPr>
         <w:t>Client: Dubai Pet Food (Retail / eCommerce)</w:t>
       </w:r>
@@ -1595,11 +1949,15 @@
         <w:spacing w:after="20" w:beforeAutospacing="0" w:afterAutospacing="0"/>
         <w:rPr>
           <w:rFonts w:ascii="Arial" w:hAnsi="Arial" w:cs="Arial"/>
+          <w:sz w:val="18"/>
+          <w:szCs w:val="18"/>
         </w:rPr>
       </w:pPr>
       <w:r>
         <w:rPr>
           <w:rFonts w:ascii="Arial" w:hAnsi="Arial" w:cs="Arial"/>
+          <w:sz w:val="18"/>
+          <w:szCs w:val="18"/>
         </w:rPr>
         <w:t>Used</w:t>
       </w:r>
@@ -1608,12 +1966,16 @@
           <w:rFonts w:ascii="Arial" w:hAnsi="Arial" w:cs="Arial"/>
           <w:b w:val="1"/>
           <w:bCs w:val="1"/>
+          <w:sz w:val="18"/>
+          <w:szCs w:val="18"/>
         </w:rPr>
         <w:t xml:space="preserve"> React  and Redux</w:t>
       </w:r>
       <w:r>
         <w:rPr>
           <w:rFonts w:ascii="Arial" w:hAnsi="Arial" w:cs="Arial"/>
+          <w:sz w:val="18"/>
+          <w:szCs w:val="18"/>
         </w:rPr>
         <w:t xml:space="preserve"> to build and optimize key user journeys including identity verification, signup/login/recovery, dynamic shopping carts and order execution pipelines.</w:t>
       </w:r>
@@ -1627,11 +1989,15 @@
         <w:spacing w:after="30" w:beforeAutospacing="0" w:afterAutospacing="0"/>
         <w:rPr>
           <w:rFonts w:ascii="Arial" w:hAnsi="Arial" w:cs="Arial"/>
+          <w:sz w:val="18"/>
+          <w:szCs w:val="18"/>
         </w:rPr>
       </w:pPr>
       <w:r>
         <w:rPr>
           <w:rFonts w:ascii="Arial" w:hAnsi="Arial" w:cs="Arial"/>
+          <w:sz w:val="18"/>
+          <w:szCs w:val="18"/>
         </w:rPr>
         <w:t>Integrated backend APIs for live transactional data, developed order-history and product-return tracking layouts, and delivered responsive static pages aligned with localized UI requirements.</w:t>
       </w:r>
@@ -1645,6 +2011,8 @@
         <w:spacing w:after="30" w:beforeAutospacing="0" w:afterAutospacing="0"/>
         <w:rPr>
           <w:rFonts w:ascii="Arial" w:hAnsi="Arial" w:cs="Arial"/>
+          <w:sz w:val="18"/>
+          <w:szCs w:val="18"/>
         </w:rPr>
       </w:pPr>
       <w:bookmarkStart w:id="14" w:name="_dx_frag_StartFragment"/>
@@ -1652,6 +2020,8 @@
       <w:r>
         <w:rPr>
           <w:rFonts w:ascii="Arial" w:hAnsi="Arial" w:cs="Arial"/>
+          <w:sz w:val="18"/>
+          <w:szCs w:val="18"/>
         </w:rPr>
         <w:t xml:space="preserve">Contributed to a 25% improvement in platform order-processing efficiency by </w:t>
       </w:r>
@@ -1660,8 +2030,8 @@
           <w:rFonts w:ascii="Arial" w:hAnsi="Arial" w:cs="Arial" w:eastAsia="Google Sans"/>
           <w:b w:val="1"/>
           <w:bCs w:val="1"/>
-          <w:sz w:val="19"/>
-          <w:szCs w:val="19"/>
+          <w:sz w:val="18"/>
+          <w:szCs w:val="18"/>
           <w:u w:val="none"/>
         </w:rPr>
         <w:t>optimizing application performance, accessibility, and the end-user experience</w:t>
@@ -1669,6 +2039,8 @@
       <w:r>
         <w:rPr>
           <w:rFonts w:ascii="Arial" w:hAnsi="Arial" w:cs="Arial"/>
+          <w:sz w:val="18"/>
+          <w:szCs w:val="18"/>
         </w:rPr>
         <w:t>.</w:t>
       </w:r>
@@ -1681,6 +2053,8 @@
         <w:ind w:hanging="173" w:left="259"/>
         <w:rPr>
           <w:rFonts w:ascii="Arial" w:hAnsi="Arial" w:cs="Arial"/>
+          <w:sz w:val="18"/>
+          <w:szCs w:val="18"/>
         </w:rPr>
       </w:pPr>
     </w:p>
@@ -1690,6 +2064,8 @@
         <w:rPr>
           <w:rFonts w:ascii="Arial" w:hAnsi="Arial" w:cs="Arial"/>
           <w:color w:val="CA6919"/>
+          <w:sz w:val="18"/>
+          <w:szCs w:val="18"/>
         </w:rPr>
       </w:pPr>
       <w:r>
@@ -1697,7 +2073,8 @@
           <w:rFonts w:ascii="Arial" w:hAnsi="Arial" w:cs="Arial"/>
           <w:b w:val="1"/>
           <w:color w:val="872600"/>
-          <w:sz w:val="20"/>
+          <w:sz w:val="18"/>
+          <w:szCs w:val="18"/>
         </w:rPr>
         <w:t>Software Engineer | Agiledge Process Solutions</w:t>
       </w:r>
@@ -1706,6 +2083,8 @@
           <w:rFonts w:ascii="Arial" w:hAnsi="Arial" w:cs="Arial"/>
           <w:i w:val="1"/>
           <w:color w:val="CA6919"/>
+          <w:sz w:val="18"/>
+          <w:szCs w:val="18"/>
         </w:rPr>
         <w:t xml:space="preserve">  •  Bangalore, India  |  </w:t>
       </w:r>
@@ -1714,6 +2093,8 @@
           <w:rFonts w:ascii="Arial" w:hAnsi="Arial" w:cs="Arial"/>
           <w:i w:val="1"/>
           <w:color w:val="CA6919"/>
+          <w:sz w:val="18"/>
+          <w:szCs w:val="18"/>
           <w:rtl w:val="0"/>
           <w:lang w:val="en-IN" w:bidi="en-IN" w:eastAsia="en-IN"/>
         </w:rPr>
@@ -1724,6 +2105,8 @@
           <w:rFonts w:ascii="Arial" w:hAnsi="Arial" w:cs="Arial"/>
           <w:i w:val="1"/>
           <w:color w:val="CA6919"/>
+          <w:sz w:val="18"/>
+          <w:szCs w:val="18"/>
         </w:rPr>
         <w:t xml:space="preserve">2017 – </w:t>
       </w:r>
@@ -1732,6 +2115,8 @@
           <w:rFonts w:ascii="Arial" w:hAnsi="Arial" w:cs="Arial"/>
           <w:i w:val="1"/>
           <w:color w:val="CA6919"/>
+          <w:sz w:val="18"/>
+          <w:szCs w:val="18"/>
           <w:rtl w:val="0"/>
           <w:lang w:val="en-IN" w:bidi="en-IN" w:eastAsia="en-IN"/>
         </w:rPr>
@@ -1742,6 +2127,8 @@
           <w:rFonts w:ascii="Arial" w:hAnsi="Arial" w:cs="Arial"/>
           <w:i w:val="1"/>
           <w:color w:val="CA6919"/>
+          <w:sz w:val="18"/>
+          <w:szCs w:val="18"/>
         </w:rPr>
         <w:t>2019</w:t>
       </w:r>
@@ -1752,6 +2139,8 @@
         <w:rPr>
           <w:rFonts w:ascii="Arial" w:hAnsi="Arial" w:cs="Arial"/>
           <w:color w:val="CA6919"/>
+          <w:sz w:val="18"/>
+          <w:szCs w:val="18"/>
         </w:rPr>
       </w:pPr>
       <w:r>
@@ -1760,6 +2149,7 @@
           <w:b w:val="1"/>
           <w:color w:val="CA6919"/>
           <w:sz w:val="18"/>
+          <w:szCs w:val="18"/>
         </w:rPr>
         <w:t>Client: Tele Radio LLC</w:t>
       </w:r>
@@ -1773,11 +2163,15 @@
         <w:spacing w:after="30" w:beforeAutospacing="0" w:afterAutospacing="0"/>
         <w:rPr>
           <w:rFonts w:ascii="Arial" w:hAnsi="Arial" w:cs="Arial"/>
+          <w:sz w:val="18"/>
+          <w:szCs w:val="18"/>
         </w:rPr>
       </w:pPr>
       <w:r>
         <w:rPr>
           <w:rFonts w:ascii="Arial" w:hAnsi="Arial" w:cs="Arial"/>
+          <w:sz w:val="18"/>
+          <w:szCs w:val="18"/>
         </w:rPr>
         <w:t>Designed and implemented UI for a PIN configurator, enhancing design capabilities for Tele Radio devices.</w:t>
       </w:r>
@@ -1787,30 +2181,8 @@
         <w:spacing w:after="30" w:beforeAutospacing="0" w:afterAutospacing="0"/>
         <w:rPr>
           <w:rFonts w:ascii="Arial" w:hAnsi="Arial" w:cs="Arial"/>
-        </w:rPr>
-      </w:pPr>
-    </w:p>
-    <w:p>
-      <w:pPr>
-        <w:spacing w:after="30" w:beforeAutospacing="0" w:afterAutospacing="0"/>
-        <w:rPr>
-          <w:rFonts w:ascii="Arial" w:hAnsi="Arial" w:cs="Arial"/>
-        </w:rPr>
-      </w:pPr>
-    </w:p>
-    <w:p>
-      <w:pPr>
-        <w:spacing w:after="30" w:beforeAutospacing="0" w:afterAutospacing="0"/>
-        <w:rPr>
-          <w:rFonts w:ascii="Arial" w:hAnsi="Arial" w:cs="Arial"/>
-        </w:rPr>
-      </w:pPr>
-    </w:p>
-    <w:p>
-      <w:pPr>
-        <w:spacing w:after="30" w:beforeAutospacing="0" w:afterAutospacing="0"/>
-        <w:rPr>
-          <w:rFonts w:ascii="Arial" w:hAnsi="Arial" w:cs="Arial"/>
+          <w:sz w:val="18"/>
+          <w:szCs w:val="18"/>
         </w:rPr>
       </w:pPr>
     </w:p>
@@ -1827,6 +2199,8 @@
         <w:rPr>
           <w:rFonts w:ascii="Arial" w:hAnsi="Arial" w:cs="Arial"/>
           <w:color w:val="446EA2"/>
+          <w:sz w:val="18"/>
+          <w:szCs w:val="18"/>
         </w:rPr>
       </w:pPr>
       <w:bookmarkStart w:id="16" w:name="_dx_frag_StartFragment"/>
@@ -1838,7 +2212,8 @@
           <w:rFonts w:ascii="Arial" w:hAnsi="Arial" w:cs="Arial"/>
           <w:b w:val="1"/>
           <w:color w:val="446EA2"/>
-          <w:sz w:val="21"/>
+          <w:sz w:val="18"/>
+          <w:szCs w:val="18"/>
           <w:rtl w:val="0"/>
           <w:lang w:val="en-IN" w:bidi="en-IN" w:eastAsia="en-IN"/>
         </w:rPr>
@@ -1851,6 +2226,8 @@
         <w:ind w:firstLine="0" w:left="0" w:right="0"/>
         <w:rPr>
           <w:rFonts w:ascii="Arial" w:hAnsi="Arial" w:cs="Arial"/>
+          <w:sz w:val="18"/>
+          <w:szCs w:val="18"/>
         </w:rPr>
       </w:pPr>
       <w:bookmarkStart w:id="18" w:name="_dx_frag_StartFragment"/>
@@ -1860,135 +2237,16 @@
           <w:rFonts w:ascii="Arial" w:hAnsi="Arial" w:cs="Arial"/>
           <w:b w:val="1"/>
           <w:bCs w:val="1"/>
-          <w:rtl w:val="0"/>
-          <w:lang w:val="en-IN" w:bidi="en-IN" w:eastAsia="en-IN"/>
-        </w:rPr>
-        <w:t>Electronics Store</w:t>
-      </w:r>
-      <w:r>
-        <w:rPr>
-          <w:rFonts w:ascii="Arial" w:hAnsi="Arial" w:cs="Arial"/>
-        </w:rPr>
-        <w:t xml:space="preserve"> | </w:t>
-      </w:r>
-      <w:r>
-        <w:rPr>
-          <w:rFonts w:ascii="Arial" w:hAnsi="Arial" w:cs="Arial"/>
-        </w:rPr>
-        <w:t>Next.js 15, React, TypeScript, CSS</w:t>
-      </w:r>
-    </w:p>
-    <w:p>
-      <w:pPr>
-        <w:numPr>
-          <w:ilvl w:val="0"/>
-          <w:numId w:val="38"/>
-        </w:numPr>
-        <w:spacing w:before="240" w:after="240" w:beforeAutospacing="0" w:afterAutospacing="0"/>
-        <w:ind w:right="0"/>
-        <w:rPr>
-          <w:rFonts w:ascii="Arial" w:hAnsi="Arial" w:cs="Arial"/>
-          <w:b w:val="0"/>
-          <w:bCs w:val="0"/>
-        </w:rPr>
-      </w:pPr>
-      <w:r>
-        <w:rPr>
-          <w:rFonts w:ascii="Arial" w:hAnsi="Arial" w:cs="Arial"/>
-          <w:b w:val="0"/>
-          <w:bCs w:val="0"/>
-        </w:rPr>
-        <w:t>Built a responsive electronics storefront with product categories, search, sorting, product details, and INR pricing.</w:t>
-      </w:r>
-    </w:p>
-    <w:p>
-      <w:pPr>
-        <w:numPr>
-          <w:ilvl w:val="0"/>
-          <w:numId w:val="38"/>
-        </w:numPr>
-        <w:spacing w:before="240" w:after="240" w:beforeAutospacing="0" w:afterAutospacing="0"/>
-        <w:ind w:right="0"/>
-        <w:rPr>
-          <w:rFonts w:ascii="Arial" w:hAnsi="Arial" w:cs="Arial"/>
-          <w:b w:val="0"/>
-          <w:bCs w:val="0"/>
-        </w:rPr>
-      </w:pPr>
-      <w:r>
-        <w:rPr>
-          <w:rFonts w:ascii="Arial" w:hAnsi="Arial" w:cs="Arial"/>
-          <w:b w:val="0"/>
-          <w:bCs w:val="0"/>
-        </w:rPr>
-        <w:t>Implemented a persistent shopping cart with quantity controls, delivery calculations, and order summaries.</w:t>
-      </w:r>
-    </w:p>
-    <w:p>
-      <w:pPr>
-        <w:numPr>
-          <w:ilvl w:val="0"/>
-          <w:numId w:val="38"/>
-        </w:numPr>
-        <w:spacing w:before="240" w:after="240" w:beforeAutospacing="0" w:afterAutospacing="0"/>
-        <w:ind w:right="0"/>
-        <w:rPr>
-          <w:rFonts w:ascii="Arial" w:hAnsi="Arial" w:cs="Arial"/>
-          <w:b w:val="0"/>
-          <w:bCs w:val="0"/>
-        </w:rPr>
-      </w:pPr>
-      <w:r>
-        <w:rPr>
-          <w:rFonts w:ascii="Arial" w:hAnsi="Arial" w:cs="Arial"/>
-          <w:b w:val="0"/>
-          <w:bCs w:val="0"/>
-        </w:rPr>
-        <w:t>Created a validated demo checkout with UPI, card, and cash-on-delivery options, plus order confirmation; no real payments are processed.</w:t>
-      </w:r>
-    </w:p>
-    <w:p>
-      <w:pPr>
-        <w:numPr>
-          <w:ilvl w:val="0"/>
-          <w:numId w:val="38"/>
-        </w:numPr>
-        <w:spacing w:before="240" w:after="240" w:beforeAutospacing="0" w:afterAutospacing="0"/>
-        <w:ind w:right="0"/>
-        <w:rPr>
-          <w:rFonts w:ascii="Arial" w:hAnsi="Arial" w:cs="Arial"/>
-          <w:b w:val="0"/>
-          <w:bCs w:val="0"/>
-        </w:rPr>
-      </w:pPr>
-      <w:r>
-        <w:rPr>
-          <w:rFonts w:ascii="Arial" w:hAnsi="Arial" w:cs="Arial"/>
-          <w:b w:val="0"/>
-          <w:bCs w:val="0"/>
-        </w:rPr>
-        <w:t>Verified the production build and tested the cart-to-checkout flow in the browser.</w:t>
-      </w:r>
-    </w:p>
-    <w:p>
-      <w:pPr>
-        <w:spacing w:before="240" w:after="240" w:beforeAutospacing="0" w:afterAutospacing="0"/>
-        <w:ind w:firstLine="0" w:left="0" w:right="0"/>
-        <w:rPr>
-          <w:rFonts w:ascii="Arial" w:hAnsi="Arial" w:cs="Arial"/>
-        </w:rPr>
-      </w:pPr>
-      <w:r>
-        <w:rPr>
-          <w:rFonts w:ascii="Arial" w:hAnsi="Arial" w:cs="Arial"/>
-          <w:b w:val="1"/>
-          <w:bCs w:val="1"/>
+          <w:sz w:val="18"/>
+          <w:szCs w:val="18"/>
         </w:rPr>
         <w:t>Online Banking Dashboard</w:t>
       </w:r>
       <w:r>
         <w:rPr>
           <w:rFonts w:ascii="Arial" w:hAnsi="Arial" w:cs="Arial"/>
+          <w:sz w:val="18"/>
+          <w:szCs w:val="18"/>
         </w:rPr>
         <w:t xml:space="preserve"> | Vue 3, TypeScript, Pinia, Vue Router, Vitest, Playwright</w:t>
       </w:r>
@@ -2003,11 +2261,15 @@
         <w:ind w:hanging="360" w:left="720" w:right="0"/>
         <w:rPr>
           <w:rFonts w:ascii="Arial" w:hAnsi="Arial" w:cs="Arial"/>
+          <w:sz w:val="18"/>
+          <w:szCs w:val="18"/>
         </w:rPr>
       </w:pPr>
       <w:r>
         <w:rPr>
           <w:rFonts w:ascii="Arial" w:hAnsi="Arial" w:cs="Arial"/>
+          <w:sz w:val="18"/>
+          <w:szCs w:val="18"/>
         </w:rPr>
         <w:t>Built an account dashboard with a transfer form, input validation and a transaction history list.</w:t>
       </w:r>
@@ -2022,11 +2284,15 @@
         <w:ind w:hanging="360" w:left="720" w:right="0"/>
         <w:rPr>
           <w:rFonts w:ascii="Arial" w:hAnsi="Arial" w:cs="Arial"/>
+          <w:sz w:val="18"/>
+          <w:szCs w:val="18"/>
         </w:rPr>
       </w:pPr>
       <w:r>
         <w:rPr>
           <w:rFonts w:ascii="Arial" w:hAnsi="Arial" w:cs="Arial"/>
+          <w:sz w:val="18"/>
+          <w:szCs w:val="18"/>
         </w:rPr>
         <w:t>Used Vue 3 with the Composition API and Pinia for state, and Vue Router for navigation.</w:t>
       </w:r>
@@ -2041,50 +2307,72 @@
         <w:ind w:hanging="360" w:left="720" w:right="0"/>
         <w:rPr>
           <w:rFonts w:ascii="Arial" w:hAnsi="Arial" w:cs="Arial"/>
+          <w:sz w:val="18"/>
+          <w:szCs w:val="18"/>
         </w:rPr>
       </w:pPr>
       <w:r>
         <w:rPr>
           <w:rFonts w:ascii="Arial" w:hAnsi="Arial" w:cs="Arial"/>
+          <w:sz w:val="18"/>
+          <w:szCs w:val="18"/>
         </w:rPr>
         <w:t>Wrote unit tests with Vitest and Vue Test Utils, and end-to-end tests with Playwright.</w:t>
       </w:r>
     </w:p>
     <w:p>
       <w:pPr>
+        <w:spacing w:before="0" w:after="0" w:beforeAutospacing="0" w:afterAutospacing="0"/>
+        <w:ind w:hanging="360" w:left="720" w:right="0"/>
+        <w:rPr>
+          <w:rFonts w:ascii="Arial" w:hAnsi="Arial" w:cs="Arial"/>
+          <w:sz w:val="18"/>
+          <w:szCs w:val="18"/>
+        </w:rPr>
+      </w:pPr>
+    </w:p>
+    <w:p>
+      <w:pPr>
+        <w:spacing w:before="0" w:after="0" w:beforeAutospacing="0" w:afterAutospacing="0"/>
+        <w:ind w:hanging="360" w:left="720" w:right="0"/>
+        <w:rPr>
+          <w:rFonts w:ascii="Arial" w:hAnsi="Arial" w:cs="Arial"/>
+          <w:sz w:val="18"/>
+          <w:szCs w:val="18"/>
+        </w:rPr>
+      </w:pPr>
+    </w:p>
+    <w:p>
+      <w:pPr>
         <w:spacing w:before="240" w:after="240" w:beforeAutospacing="0" w:afterAutospacing="0"/>
         <w:ind w:firstLine="0" w:left="0" w:right="0"/>
         <w:rPr>
           <w:rFonts w:ascii="Arial" w:hAnsi="Arial" w:cs="Arial"/>
-        </w:rPr>
-      </w:pPr>
+          <w:sz w:val="18"/>
+          <w:szCs w:val="18"/>
+        </w:rPr>
+      </w:pPr>
+      <w:bookmarkStart w:id="19" w:name="_dx_frag_StartFragment"/>
+      <w:bookmarkEnd w:id="19"/>
       <w:r>
         <w:rPr>
           <w:rFonts w:ascii="Arial" w:hAnsi="Arial" w:cs="Arial"/>
           <w:b w:val="1"/>
           <w:bCs w:val="1"/>
-        </w:rPr>
-        <w:t>Proof of Concept for Client Demo: AWS Cognito to Auth0 Migration</w:t>
+          <w:sz w:val="18"/>
+          <w:szCs w:val="18"/>
+          <w:rtl w:val="0"/>
+          <w:lang w:val="en-IN" w:bidi="en-IN" w:eastAsia="en-IN"/>
+        </w:rPr>
+        <w:t>Electronics Store</w:t>
       </w:r>
       <w:r>
         <w:rPr>
           <w:rFonts w:ascii="Arial" w:hAnsi="Arial" w:cs="Arial"/>
-          <w:b w:val="1"/>
-          <w:bCs w:val="1"/>
-          <w:rtl w:val="0"/>
-          <w:lang w:val="en-IN" w:bidi="en-IN" w:eastAsia="en-IN"/>
-        </w:rPr>
-        <w:t xml:space="preserve"> - </w:t>
-      </w:r>
-      <w:r>
-        <w:rPr>
-          <w:rFonts w:ascii="Arial" w:hAnsi="Arial" w:cs="Arial"/>
-          <w:b w:val="0"/>
-          <w:bCs w:val="0"/>
-          <w:rtl w:val="0"/>
-          <w:lang w:val="en-IN" w:bidi="en-IN" w:eastAsia="en-IN"/>
-        </w:rPr>
-        <w:t>JavaScript</w:t>
+          <w:sz w:val="18"/>
+          <w:szCs w:val="18"/>
+        </w:rPr>
+        <w:t xml:space="preserve"> | Next.js 15, React, TypeScript, CSS</w:t>
       </w:r>
     </w:p>
     <w:p>
@@ -2097,13 +2385,17 @@
         <w:ind w:hanging="360" w:left="720" w:right="0"/>
         <w:rPr>
           <w:rFonts w:ascii="Arial" w:hAnsi="Arial" w:cs="Arial"/>
+          <w:sz w:val="18"/>
+          <w:szCs w:val="18"/>
         </w:rPr>
       </w:pPr>
       <w:r>
         <w:rPr>
           <w:rFonts w:ascii="Arial" w:hAnsi="Arial" w:cs="Arial"/>
-        </w:rPr>
-        <w:t>Researched and built the proof of concept in 2 days, with no earlier experience in either tool.</w:t>
+          <w:sz w:val="18"/>
+          <w:szCs w:val="18"/>
+        </w:rPr>
+        <w:t>Built a responsive electronics storefront with product categories, search, sorting, product details, and INR pricing.</w:t>
       </w:r>
     </w:p>
     <w:p>
@@ -2116,11 +2408,152 @@
         <w:ind w:hanging="360" w:left="720" w:right="0"/>
         <w:rPr>
           <w:rFonts w:ascii="Arial" w:hAnsi="Arial" w:cs="Arial"/>
+          <w:sz w:val="18"/>
+          <w:szCs w:val="18"/>
         </w:rPr>
       </w:pPr>
       <w:r>
         <w:rPr>
           <w:rFonts w:ascii="Arial" w:hAnsi="Arial" w:cs="Arial"/>
+          <w:sz w:val="18"/>
+          <w:szCs w:val="18"/>
+        </w:rPr>
+        <w:t>Implemented a persistent shopping cart with quantity controls, delivery calculations, and order summaries.</w:t>
+      </w:r>
+    </w:p>
+    <w:p>
+      <w:pPr>
+        <w:numPr>
+          <w:ilvl w:val="0"/>
+          <w:numId w:val="35"/>
+        </w:numPr>
+        <w:spacing w:before="0" w:after="0" w:beforeAutospacing="0" w:afterAutospacing="0"/>
+        <w:ind w:hanging="360" w:left="720" w:right="0"/>
+        <w:rPr>
+          <w:rFonts w:ascii="Arial" w:hAnsi="Arial" w:cs="Arial"/>
+          <w:sz w:val="18"/>
+          <w:szCs w:val="18"/>
+        </w:rPr>
+      </w:pPr>
+      <w:r>
+        <w:rPr>
+          <w:rFonts w:ascii="Arial" w:hAnsi="Arial" w:cs="Arial"/>
+          <w:sz w:val="18"/>
+          <w:szCs w:val="18"/>
+        </w:rPr>
+        <w:t>Created a validated demo checkout with UPI, card, and cash-on-delivery options, plus order confirmation; no real payments are processed.</w:t>
+      </w:r>
+    </w:p>
+    <w:p>
+      <w:pPr>
+        <w:numPr>
+          <w:ilvl w:val="0"/>
+          <w:numId w:val="35"/>
+        </w:numPr>
+        <w:spacing w:before="0" w:after="0" w:beforeAutospacing="0" w:afterAutospacing="0"/>
+        <w:ind w:hanging="360" w:left="720" w:right="0"/>
+        <w:rPr>
+          <w:rFonts w:ascii="Arial" w:hAnsi="Arial" w:cs="Arial"/>
+          <w:sz w:val="18"/>
+          <w:szCs w:val="18"/>
+        </w:rPr>
+      </w:pPr>
+      <w:r>
+        <w:rPr>
+          <w:rFonts w:ascii="Arial" w:hAnsi="Arial" w:cs="Arial"/>
+          <w:sz w:val="18"/>
+          <w:szCs w:val="18"/>
+        </w:rPr>
+        <w:t>Verified the production build and tested the cart-to-checkout flow in the browser.</w:t>
+      </w:r>
+    </w:p>
+    <w:p>
+      <w:pPr>
+        <w:spacing w:before="240" w:after="240" w:beforeAutospacing="0" w:afterAutospacing="0"/>
+        <w:ind w:firstLine="0" w:left="0" w:right="0"/>
+        <w:rPr>
+          <w:rFonts w:ascii="Arial" w:hAnsi="Arial" w:cs="Arial"/>
+          <w:sz w:val="18"/>
+          <w:szCs w:val="18"/>
+        </w:rPr>
+      </w:pPr>
+      <w:r>
+        <w:rPr>
+          <w:rFonts w:ascii="Arial" w:hAnsi="Arial" w:cs="Arial"/>
+          <w:b w:val="1"/>
+          <w:bCs w:val="1"/>
+          <w:sz w:val="18"/>
+          <w:szCs w:val="18"/>
+        </w:rPr>
+        <w:t>Proof of Concept for Client Demo: AWS Cognito to Auth0 Migration</w:t>
+      </w:r>
+      <w:r>
+        <w:rPr>
+          <w:rFonts w:ascii="Arial" w:hAnsi="Arial" w:cs="Arial"/>
+          <w:b w:val="1"/>
+          <w:bCs w:val="1"/>
+          <w:sz w:val="18"/>
+          <w:szCs w:val="18"/>
+          <w:rtl w:val="0"/>
+          <w:lang w:val="en-IN" w:bidi="en-IN" w:eastAsia="en-IN"/>
+        </w:rPr>
+        <w:t xml:space="preserve"> - </w:t>
+      </w:r>
+      <w:r>
+        <w:rPr>
+          <w:rFonts w:ascii="Arial" w:hAnsi="Arial" w:cs="Arial"/>
+          <w:b w:val="0"/>
+          <w:bCs w:val="0"/>
+          <w:sz w:val="18"/>
+          <w:szCs w:val="18"/>
+          <w:rtl w:val="0"/>
+          <w:lang w:val="en-IN" w:bidi="en-IN" w:eastAsia="en-IN"/>
+        </w:rPr>
+        <w:t>JavaScript</w:t>
+      </w:r>
+    </w:p>
+    <w:p>
+      <w:pPr>
+        <w:numPr>
+          <w:ilvl w:val="0"/>
+          <w:numId w:val="35"/>
+        </w:numPr>
+        <w:spacing w:before="0" w:after="0" w:beforeAutospacing="0" w:afterAutospacing="0"/>
+        <w:ind w:hanging="360" w:left="720" w:right="0"/>
+        <w:rPr>
+          <w:rFonts w:ascii="Arial" w:hAnsi="Arial" w:cs="Arial"/>
+          <w:sz w:val="18"/>
+          <w:szCs w:val="18"/>
+        </w:rPr>
+      </w:pPr>
+      <w:r>
+        <w:rPr>
+          <w:rFonts w:ascii="Arial" w:hAnsi="Arial" w:cs="Arial"/>
+          <w:sz w:val="18"/>
+          <w:szCs w:val="18"/>
+        </w:rPr>
+        <w:t>Researched and built the proof of concept in 2 days, with no earlier experience in either tool.</w:t>
+      </w:r>
+    </w:p>
+    <w:p>
+      <w:pPr>
+        <w:numPr>
+          <w:ilvl w:val="0"/>
+          <w:numId w:val="35"/>
+        </w:numPr>
+        <w:spacing w:before="0" w:after="0" w:beforeAutospacing="0" w:afterAutospacing="0"/>
+        <w:ind w:hanging="360" w:left="720" w:right="0"/>
+        <w:rPr>
+          <w:rFonts w:ascii="Arial" w:hAnsi="Arial" w:cs="Arial"/>
+          <w:sz w:val="18"/>
+          <w:szCs w:val="18"/>
+        </w:rPr>
+      </w:pPr>
+      <w:r>
+        <w:rPr>
+          <w:rFonts w:ascii="Arial" w:hAnsi="Arial" w:cs="Arial"/>
+          <w:sz w:val="18"/>
+          <w:szCs w:val="18"/>
         </w:rPr>
         <w:t>Used it to show the client how the migration would work.</w:t>
       </w:r>
@@ -2131,6 +2564,8 @@
         <w:ind w:firstLine="0" w:left="0" w:right="0"/>
         <w:rPr>
           <w:rFonts w:ascii="Arial" w:hAnsi="Arial" w:cs="Arial"/>
+          <w:sz w:val="18"/>
+          <w:szCs w:val="18"/>
         </w:rPr>
       </w:pPr>
       <w:r>
@@ -2138,6 +2573,8 @@
           <w:rFonts w:ascii="Arial" w:hAnsi="Arial" w:cs="Arial"/>
           <w:b w:val="1"/>
           <w:bCs w:val="1"/>
+          <w:sz w:val="18"/>
+          <w:szCs w:val="18"/>
         </w:rPr>
         <w:t>SAP Integration Hub</w:t>
       </w:r>
@@ -2146,6 +2583,8 @@
           <w:rFonts w:ascii="Arial" w:hAnsi="Arial" w:cs="Arial"/>
           <w:b w:val="1"/>
           <w:bCs w:val="1"/>
+          <w:sz w:val="18"/>
+          <w:szCs w:val="18"/>
           <w:rtl w:val="0"/>
           <w:lang w:val="en-IN" w:bidi="en-IN" w:eastAsia="en-IN"/>
         </w:rPr>
@@ -2156,6 +2595,8 @@
           <w:rFonts w:ascii="Arial" w:hAnsi="Arial" w:cs="Arial"/>
           <w:b w:val="0"/>
           <w:bCs w:val="0"/>
+          <w:sz w:val="18"/>
+          <w:szCs w:val="18"/>
           <w:rtl w:val="0"/>
           <w:lang w:val="en-IN" w:bidi="en-IN" w:eastAsia="en-IN"/>
         </w:rPr>
@@ -2172,16 +2613,20 @@
         <w:ind w:hanging="360" w:left="720" w:right="0"/>
         <w:rPr>
           <w:rFonts w:ascii="Arial" w:hAnsi="Arial" w:cs="Arial"/>
+          <w:sz w:val="18"/>
+          <w:szCs w:val="18"/>
         </w:rPr>
       </w:pPr>
       <w:r>
         <w:rPr>
           <w:rFonts w:ascii="Arial" w:hAnsi="Arial" w:cs="Arial"/>
+          <w:sz w:val="18"/>
+          <w:szCs w:val="18"/>
         </w:rPr>
         <w:t>Worked with the team on an integration hub to speed up work for the DevOps team.</w:t>
       </w:r>
-      <w:bookmarkStart w:id="19" w:name="_dx_frag_EndFragment"/>
-      <w:bookmarkEnd w:id="19"/>
+      <w:bookmarkStart w:id="20" w:name="_dx_frag_EndFragment"/>
+      <w:bookmarkEnd w:id="20"/>
     </w:p>
     <w:p>
       <w:pPr>
@@ -2189,6 +2634,8 @@
         <w:ind w:hanging="173" w:left="259"/>
         <w:rPr>
           <w:rFonts w:ascii="Arial" w:hAnsi="Arial" w:cs="Arial"/>
+          <w:sz w:val="18"/>
+          <w:szCs w:val="18"/>
         </w:rPr>
       </w:pPr>
     </w:p>
@@ -2205,6 +2652,8 @@
         <w:rPr>
           <w:rFonts w:ascii="Arial" w:hAnsi="Arial" w:cs="Arial"/>
           <w:color w:val="446EA2"/>
+          <w:sz w:val="18"/>
+          <w:szCs w:val="18"/>
         </w:rPr>
       </w:pPr>
       <w:r>
@@ -2212,7 +2661,8 @@
           <w:rFonts w:ascii="Arial" w:hAnsi="Arial" w:cs="Arial"/>
           <w:b w:val="1"/>
           <w:color w:val="446EA2"/>
-          <w:sz w:val="21"/>
+          <w:sz w:val="18"/>
+          <w:szCs w:val="18"/>
           <w:rtl w:val="0"/>
           <w:lang w:val="en-IN" w:bidi="en-IN" w:eastAsia="en-IN"/>
         </w:rPr>
@@ -2226,7 +2676,8 @@
         <w:rPr>
           <w:rFonts w:ascii="Arial" w:hAnsi="Arial" w:cs="Arial" w:eastAsia="Google Sans"/>
           <w:b w:val="0"/>
-          <w:sz w:val="19"/>
+          <w:sz w:val="18"/>
+          <w:szCs w:val="18"/>
           <w:u w:val="none"/>
         </w:rPr>
       </w:pPr>
@@ -2235,12 +2686,16 @@
           <w:rFonts w:ascii="Arial" w:hAnsi="Arial" w:cs="Arial"/>
           <w:b w:val="1"/>
           <w:bCs w:val="1"/>
+          <w:sz w:val="18"/>
+          <w:szCs w:val="18"/>
         </w:rPr>
         <w:t xml:space="preserve">•  React-Centered Enterprise Expertise: </w:t>
       </w:r>
       <w:r>
         <w:rPr>
           <w:rFonts w:ascii="Arial" w:hAnsi="Arial" w:cs="Arial"/>
+          <w:sz w:val="18"/>
+          <w:szCs w:val="18"/>
         </w:rPr>
         <w:t>8.5+ years of hands-on experience building, scaling and maintaining complex enterprise platforms, eCommerce applications and mobile products, with deep React, Redux and TypeScript expertise alongside Angular.</w:t>
       </w:r>
@@ -2252,7 +2707,8 @@
         <w:rPr>
           <w:rFonts w:ascii="Arial" w:hAnsi="Arial" w:cs="Arial" w:eastAsia="Google Sans"/>
           <w:b w:val="0"/>
-          <w:sz w:val="19"/>
+          <w:sz w:val="18"/>
+          <w:szCs w:val="18"/>
           <w:u w:val="none"/>
         </w:rPr>
       </w:pPr>
@@ -2260,7 +2716,8 @@
         <w:rPr>
           <w:rFonts w:ascii="Arial" w:hAnsi="Arial" w:cs="Arial" w:eastAsia="Google Sans"/>
           <w:b w:val="0"/>
-          <w:sz w:val="19"/>
+          <w:sz w:val="18"/>
+          <w:szCs w:val="18"/>
           <w:u w:val="none"/>
         </w:rPr>
         <w:t xml:space="preserve">•  </w:t>
@@ -2270,8 +2727,8 @@
           <w:rFonts w:ascii="Arial" w:hAnsi="Arial" w:cs="Arial" w:eastAsia="Google Sans"/>
           <w:b w:val="1"/>
           <w:bCs w:val="1"/>
-          <w:sz w:val="19"/>
-          <w:szCs w:val="19"/>
+          <w:sz w:val="18"/>
+          <w:szCs w:val="18"/>
           <w:u w:val="none"/>
         </w:rPr>
         <w:t>End-to-End Frontend Engineering:</w:t>
@@ -2280,8 +2737,8 @@
         <w:rPr>
           <w:rFonts w:ascii="Arial" w:hAnsi="Arial" w:cs="Arial" w:eastAsia="Google Sans"/>
           <w:b w:val="0"/>
-          <w:sz w:val="19"/>
-          <w:szCs w:val="19"/>
+          <w:sz w:val="18"/>
+          <w:szCs w:val="18"/>
           <w:u w:val="none"/>
         </w:rPr>
         <w:t xml:space="preserve"> Proven track record delivering production-ready code with a focus on reusable component libraries, responsive UI design, secure API integrations, and robust form validation.</w:t>
@@ -2294,7 +2751,8 @@
         <w:rPr>
           <w:rFonts w:ascii="Arial" w:hAnsi="Arial" w:cs="Arial" w:eastAsia="Google Sans"/>
           <w:b w:val="0"/>
-          <w:sz w:val="19"/>
+          <w:sz w:val="18"/>
+          <w:szCs w:val="18"/>
           <w:u w:val="none"/>
         </w:rPr>
       </w:pPr>
@@ -2303,12 +2761,16 @@
           <w:rFonts w:ascii="Arial" w:hAnsi="Arial" w:cs="Arial"/>
           <w:b w:val="1"/>
           <w:bCs w:val="1"/>
+          <w:sz w:val="18"/>
+          <w:szCs w:val="18"/>
         </w:rPr>
         <w:t xml:space="preserve">•  Retail &amp; eCommerce Experience: </w:t>
       </w:r>
       <w:r>
         <w:rPr>
           <w:rFonts w:ascii="Arial" w:hAnsi="Arial" w:cs="Arial"/>
+          <w:sz w:val="18"/>
+          <w:szCs w:val="18"/>
         </w:rPr>
         <w:t>Built shopping carts, order execution, order history, product-return tracking and authentication flows for eCommerce platforms, contributing to a 25% improvement in order-processing efficiency.</w:t>
       </w:r>
@@ -2320,7 +2782,8 @@
         <w:rPr>
           <w:rFonts w:ascii="Arial" w:hAnsi="Arial" w:cs="Arial" w:eastAsia="Google Sans"/>
           <w:b w:val="0"/>
-          <w:sz w:val="19"/>
+          <w:sz w:val="18"/>
+          <w:szCs w:val="18"/>
           <w:u w:val="none"/>
         </w:rPr>
       </w:pPr>
@@ -2328,7 +2791,8 @@
         <w:rPr>
           <w:rFonts w:ascii="Arial" w:hAnsi="Arial" w:cs="Arial" w:eastAsia="Google Sans"/>
           <w:b w:val="0"/>
-          <w:sz w:val="19"/>
+          <w:sz w:val="18"/>
+          <w:szCs w:val="18"/>
           <w:u w:val="none"/>
         </w:rPr>
         <w:t xml:space="preserve">•  </w:t>
@@ -2338,8 +2802,8 @@
           <w:rFonts w:ascii="Arial" w:hAnsi="Arial" w:cs="Arial" w:eastAsia="Google Sans"/>
           <w:b w:val="1"/>
           <w:bCs w:val="1"/>
-          <w:sz w:val="19"/>
-          <w:szCs w:val="19"/>
+          <w:sz w:val="18"/>
+          <w:szCs w:val="18"/>
           <w:u w:val="none"/>
         </w:rPr>
         <w:t>Accessibility &amp; Quality Assurance:</w:t>
@@ -2348,8 +2812,8 @@
         <w:rPr>
           <w:rFonts w:ascii="Arial" w:hAnsi="Arial" w:cs="Arial" w:eastAsia="Google Sans"/>
           <w:b w:val="0"/>
-          <w:sz w:val="19"/>
-          <w:szCs w:val="19"/>
+          <w:sz w:val="18"/>
+          <w:szCs w:val="18"/>
           <w:u w:val="none"/>
         </w:rPr>
         <w:t xml:space="preserve"> Deep expertise in enforcing strict WCAG compliance alongside modern testing frameworks (Playwright, Cypress, Karma/Jasmine) to ensure high-performance, bug-free deployment.</w:t>
@@ -2362,7 +2826,8 @@
         <w:rPr>
           <w:rFonts w:ascii="Arial" w:hAnsi="Arial" w:cs="Arial" w:eastAsia="Google Sans"/>
           <w:b w:val="0"/>
-          <w:sz w:val="19"/>
+          <w:sz w:val="18"/>
+          <w:szCs w:val="18"/>
           <w:u w:val="none"/>
         </w:rPr>
       </w:pPr>
@@ -2370,7 +2835,8 @@
         <w:rPr>
           <w:rFonts w:ascii="Arial" w:hAnsi="Arial" w:cs="Arial" w:eastAsia="Google Sans"/>
           <w:b w:val="0"/>
-          <w:sz w:val="19"/>
+          <w:sz w:val="18"/>
+          <w:szCs w:val="18"/>
           <w:u w:val="none"/>
         </w:rPr>
         <w:t xml:space="preserve">•  </w:t>
@@ -2380,8 +2846,8 @@
           <w:rFonts w:ascii="Arial" w:hAnsi="Arial" w:cs="Arial" w:eastAsia="Google Sans"/>
           <w:b w:val="1"/>
           <w:bCs w:val="1"/>
-          <w:sz w:val="19"/>
-          <w:szCs w:val="19"/>
+          <w:sz w:val="18"/>
+          <w:szCs w:val="18"/>
           <w:u w:val="none"/>
         </w:rPr>
         <w:t>Agile Collaboration &amp; Delivery:</w:t>
@@ -2390,8 +2856,8 @@
         <w:rPr>
           <w:rFonts w:ascii="Arial" w:hAnsi="Arial" w:cs="Arial" w:eastAsia="Google Sans"/>
           <w:b w:val="0"/>
-          <w:sz w:val="19"/>
-          <w:szCs w:val="19"/>
+          <w:sz w:val="18"/>
+          <w:szCs w:val="18"/>
           <w:u w:val="none"/>
         </w:rPr>
         <w:t xml:space="preserve"> Active contributor in Agile environments, driving requirement gathering, technical design, accurate estimations, and cross-functional team alignment.</w:t>
@@ -2402,8 +2868,8 @@
         <w:rPr>
           <w:rFonts w:ascii="Arial" w:hAnsi="Arial" w:cs="Arial" w:eastAsia="Google Sans"/>
           <w:b w:val="0"/>
-          <w:sz w:val="19"/>
-          <w:szCs w:val="19"/>
+          <w:sz w:val="18"/>
+          <w:szCs w:val="18"/>
           <w:u w:val="none"/>
         </w:rPr>
       </w:pPr>
@@ -2411,7 +2877,8 @@
         <w:rPr>
           <w:rFonts w:ascii="Arial" w:hAnsi="Arial" w:cs="Arial" w:eastAsia="Google Sans"/>
           <w:b w:val="0"/>
-          <w:sz w:val="19"/>
+          <w:sz w:val="18"/>
+          <w:szCs w:val="18"/>
           <w:u w:val="none"/>
         </w:rPr>
         <w:t xml:space="preserve">•  </w:t>
@@ -2421,8 +2888,8 @@
           <w:rFonts w:ascii="Arial" w:hAnsi="Arial" w:cs="Arial" w:eastAsia="Google Sans"/>
           <w:b w:val="1"/>
           <w:bCs w:val="1"/>
-          <w:sz w:val="19"/>
-          <w:szCs w:val="19"/>
+          <w:sz w:val="18"/>
+          <w:szCs w:val="18"/>
           <w:u w:val="none"/>
         </w:rPr>
         <w:t>Rapid Technology Adaptation:</w:t>
@@ -2431,14 +2898,14 @@
         <w:rPr>
           <w:rFonts w:ascii="Arial" w:hAnsi="Arial" w:cs="Arial" w:eastAsia="Google Sans"/>
           <w:b w:val="0"/>
-          <w:sz w:val="19"/>
-          <w:szCs w:val="19"/>
+          <w:sz w:val="18"/>
+          <w:szCs w:val="18"/>
           <w:u w:val="none"/>
         </w:rPr>
         <w:t xml:space="preserve"> Researched, mapped out, and built a complex AWS Cognito to Auth0 migration Proof of Concept (PoC) within 2 days with no prior exposure to either technology.</w:t>
       </w:r>
-      <w:bookmarkStart w:id="20" w:name="_dx_frag_EndFragment"/>
-      <w:bookmarkEnd w:id="20"/>
+      <w:bookmarkStart w:id="21" w:name="_dx_frag_EndFragment"/>
+      <w:bookmarkEnd w:id="21"/>
     </w:p>
     <w:p>
       <w:pPr>
@@ -2446,6 +2913,8 @@
         <w:ind w:firstLine="0" w:left="0"/>
         <w:rPr>
           <w:rFonts w:ascii="Arial" w:hAnsi="Arial" w:cs="Arial"/>
+          <w:sz w:val="18"/>
+          <w:szCs w:val="18"/>
         </w:rPr>
       </w:pPr>
     </w:p>
@@ -2462,6 +2931,8 @@
         <w:rPr>
           <w:rFonts w:ascii="Arial" w:hAnsi="Arial" w:cs="Arial"/>
           <w:color w:val="446EA2"/>
+          <w:sz w:val="18"/>
+          <w:szCs w:val="18"/>
         </w:rPr>
       </w:pPr>
       <w:r>
@@ -2469,7 +2940,8 @@
           <w:rFonts w:ascii="Arial" w:hAnsi="Arial" w:cs="Arial"/>
           <w:b w:val="1"/>
           <w:color w:val="446EA2"/>
-          <w:sz w:val="21"/>
+          <w:sz w:val="18"/>
+          <w:szCs w:val="18"/>
         </w:rPr>
         <w:t>EDUCATION</w:t>
       </w:r>
@@ -2478,24 +2950,32 @@
       <w:pPr>
         <w:rPr>
           <w:rFonts w:ascii="Arial" w:hAnsi="Arial" w:cs="Arial"/>
+          <w:sz w:val="18"/>
+          <w:szCs w:val="18"/>
         </w:rPr>
       </w:pPr>
       <w:r>
         <w:rPr>
           <w:rFonts w:ascii="Arial" w:hAnsi="Arial" w:cs="Arial"/>
           <w:b w:val="1"/>
+          <w:sz w:val="18"/>
+          <w:szCs w:val="18"/>
         </w:rPr>
         <w:t>Bachelor of Engineering (B.E.), Electronics &amp; Communication Engineering</w:t>
       </w:r>
       <w:r>
         <w:rPr>
           <w:rFonts w:ascii="Arial" w:hAnsi="Arial" w:cs="Arial"/>
+          <w:sz w:val="18"/>
+          <w:szCs w:val="18"/>
         </w:rPr>
         <w:t xml:space="preserve"> — Vivekananda College of Engineering and Technology, Puttur, India</w:t>
       </w:r>
       <w:r>
         <w:rPr>
           <w:rFonts w:ascii="Arial" w:hAnsi="Arial" w:cs="Arial"/>
+          <w:sz w:val="18"/>
+          <w:szCs w:val="18"/>
           <w:rtl w:val="0"/>
           <w:lang w:val="en-IN" w:bidi="en-IN" w:eastAsia="en-IN"/>
         </w:rPr>
@@ -2506,6 +2986,8 @@
       <w:pPr>
         <w:rPr>
           <w:rFonts w:ascii="Arial" w:hAnsi="Arial" w:cs="Arial"/>
+          <w:sz w:val="18"/>
+          <w:szCs w:val="18"/>
         </w:rPr>
       </w:pPr>
     </w:p>
@@ -2522,6 +3004,8 @@
         <w:rPr>
           <w:rFonts w:ascii="Arial" w:hAnsi="Arial" w:cs="Arial"/>
           <w:color w:val="446EA2"/>
+          <w:sz w:val="18"/>
+          <w:szCs w:val="18"/>
         </w:rPr>
       </w:pPr>
       <w:r>
@@ -2529,7 +3013,8 @@
           <w:rFonts w:ascii="Arial" w:hAnsi="Arial" w:cs="Arial"/>
           <w:b w:val="1"/>
           <w:color w:val="446EA2"/>
-          <w:sz w:val="21"/>
+          <w:sz w:val="18"/>
+          <w:szCs w:val="18"/>
         </w:rPr>
         <w:t>CERTIFICATIONS</w:t>
       </w:r>
@@ -2540,18 +3025,24 @@
         <w:ind w:hanging="173" w:left="259"/>
         <w:rPr>
           <w:rFonts w:ascii="Arial" w:hAnsi="Arial" w:cs="Arial"/>
+          <w:sz w:val="18"/>
+          <w:szCs w:val="18"/>
         </w:rPr>
       </w:pPr>
       <w:r>
         <w:rPr>
           <w:rFonts w:ascii="Arial" w:hAnsi="Arial" w:cs="Arial"/>
           <w:b w:val="1"/>
+          <w:sz w:val="18"/>
+          <w:szCs w:val="18"/>
         </w:rPr>
         <w:t xml:space="preserve">• </w:t>
       </w:r>
       <w:r>
         <w:rPr>
           <w:rFonts w:ascii="Arial" w:hAnsi="Arial" w:cs="Arial"/>
+          <w:sz w:val="18"/>
+          <w:szCs w:val="18"/>
         </w:rPr>
         <w:t>Infosys Certified React Expert</w:t>
       </w:r>
@@ -2562,18 +3053,24 @@
         <w:ind w:hanging="173" w:left="259"/>
         <w:rPr>
           <w:rFonts w:ascii="Arial" w:hAnsi="Arial" w:cs="Arial"/>
+          <w:sz w:val="18"/>
+          <w:szCs w:val="18"/>
         </w:rPr>
       </w:pPr>
       <w:r>
         <w:rPr>
           <w:rFonts w:ascii="Arial" w:hAnsi="Arial" w:cs="Arial"/>
           <w:b w:val="1"/>
+          <w:sz w:val="18"/>
+          <w:szCs w:val="18"/>
         </w:rPr>
         <w:t xml:space="preserve">• </w:t>
       </w:r>
       <w:r>
         <w:rPr>
           <w:rFonts w:ascii="Arial" w:hAnsi="Arial" w:cs="Arial"/>
+          <w:sz w:val="18"/>
+          <w:szCs w:val="18"/>
         </w:rPr>
         <w:t>Infosys Certified React Web Developer</w:t>
       </w:r>
@@ -2584,18 +3081,24 @@
         <w:ind w:hanging="173" w:left="259"/>
         <w:rPr>
           <w:rFonts w:ascii="Arial" w:hAnsi="Arial" w:cs="Arial"/>
+          <w:sz w:val="18"/>
+          <w:szCs w:val="18"/>
         </w:rPr>
       </w:pPr>
       <w:r>
         <w:rPr>
           <w:rFonts w:ascii="Arial" w:hAnsi="Arial" w:cs="Arial"/>
           <w:b w:val="1"/>
+          <w:sz w:val="18"/>
+          <w:szCs w:val="18"/>
         </w:rPr>
         <w:t xml:space="preserve">• </w:t>
       </w:r>
       <w:r>
         <w:rPr>
           <w:rFonts w:ascii="Arial" w:hAnsi="Arial" w:cs="Arial"/>
+          <w:sz w:val="18"/>
+          <w:szCs w:val="18"/>
         </w:rPr>
         <w:t>Infosys Certified Angular Web Developer</w:t>
       </w:r>
@@ -2606,18 +3109,24 @@
         <w:ind w:hanging="173" w:left="259"/>
         <w:rPr>
           <w:rFonts w:ascii="Arial" w:hAnsi="Arial" w:cs="Arial"/>
+          <w:sz w:val="18"/>
+          <w:szCs w:val="18"/>
         </w:rPr>
       </w:pPr>
       <w:r>
         <w:rPr>
           <w:rFonts w:ascii="Arial" w:hAnsi="Arial" w:cs="Arial"/>
           <w:b w:val="1"/>
+          <w:sz w:val="18"/>
+          <w:szCs w:val="18"/>
         </w:rPr>
         <w:t xml:space="preserve">• </w:t>
       </w:r>
       <w:r>
         <w:rPr>
           <w:rFonts w:ascii="Arial" w:hAnsi="Arial" w:cs="Arial"/>
+          <w:sz w:val="18"/>
+          <w:szCs w:val="18"/>
         </w:rPr>
         <w:t>Infosys Certified Front End Web Developer</w:t>
       </w:r>
@@ -2628,18 +3137,24 @@
         <w:ind w:hanging="173" w:left="259"/>
         <w:rPr>
           <w:rFonts w:ascii="Arial" w:hAnsi="Arial" w:cs="Arial"/>
+          <w:sz w:val="18"/>
+          <w:szCs w:val="18"/>
         </w:rPr>
       </w:pPr>
       <w:r>
         <w:rPr>
           <w:rFonts w:ascii="Arial" w:hAnsi="Arial" w:cs="Arial"/>
           <w:b w:val="1"/>
+          <w:sz w:val="18"/>
+          <w:szCs w:val="18"/>
         </w:rPr>
         <w:t xml:space="preserve">• </w:t>
       </w:r>
       <w:r>
         <w:rPr>
           <w:rFonts w:ascii="Arial" w:hAnsi="Arial" w:cs="Arial"/>
+          <w:sz w:val="18"/>
+          <w:szCs w:val="18"/>
         </w:rPr>
         <w:t>Certified in Web Technologies — JSpiders, Bengaluru</w:t>
       </w:r>
@@ -2649,8 +3164,8 @@
         <w:rPr>
           <w:rFonts w:ascii="Arial" w:hAnsi="Arial" w:cs="Arial" w:eastAsia="Google Sans"/>
           <w:b w:val="0"/>
-          <w:sz w:val="19"/>
-          <w:szCs w:val="19"/>
+          <w:sz w:val="18"/>
+          <w:szCs w:val="18"/>
           <w:u w:val="none"/>
         </w:rPr>
       </w:pPr>
@@ -2668,6 +3183,8 @@
         <w:rPr>
           <w:rFonts w:ascii="Arial" w:hAnsi="Arial" w:cs="Arial"/>
           <w:color w:val="446EA2"/>
+          <w:sz w:val="18"/>
+          <w:szCs w:val="18"/>
         </w:rPr>
       </w:pPr>
       <w:r>
@@ -2675,7 +3192,8 @@
           <w:rFonts w:ascii="Arial" w:hAnsi="Arial" w:cs="Arial"/>
           <w:b w:val="1"/>
           <w:color w:val="446EA2"/>
-          <w:sz w:val="21"/>
+          <w:sz w:val="18"/>
+          <w:szCs w:val="18"/>
           <w:rtl w:val="0"/>
           <w:lang w:val="en-IN" w:bidi="en-IN" w:eastAsia="en-IN"/>
         </w:rPr>
@@ -2686,13 +3204,17 @@
       <w:pPr>
         <w:rPr>
           <w:rFonts w:ascii="Arial" w:hAnsi="Arial" w:cs="Arial"/>
-        </w:rPr>
-      </w:pPr>
-      <w:bookmarkStart w:id="21" w:name="_dx_frag_StartFragment"/>
-      <w:bookmarkEnd w:id="21"/>
+          <w:sz w:val="18"/>
+          <w:szCs w:val="18"/>
+        </w:rPr>
+      </w:pPr>
+      <w:bookmarkStart w:id="22" w:name="_dx_frag_StartFragment"/>
+      <w:bookmarkEnd w:id="22"/>
       <w:r>
         <w:rPr>
           <w:rFonts w:ascii="Arial" w:hAnsi="Arial" w:cs="Arial"/>
+          <w:sz w:val="18"/>
+          <w:szCs w:val="18"/>
           <w:rtl w:val="0"/>
           <w:lang w:val="en-IN" w:bidi="en-IN" w:eastAsia="en-IN"/>
         </w:rPr>
@@ -7030,6 +7552,127 @@
       </w:rPr>
     </w:lvl>
     <w:lvl w:ilvl="8" w:tplc="09013F7E">
+      <w:start w:val="1"/>
+      <w:numFmt w:val="bullet"/>
+      <w:suff w:val="tab"/>
+      <w:lvlText w:val="·"/>
+      <w:lvlJc w:val="left"/>
+      <w:pPr>
+        <w:ind w:hanging="360" w:left="6480"/>
+      </w:pPr>
+      <w:rPr>
+        <w:rFonts w:ascii="Symbol" w:hAnsi="Symbol"/>
+      </w:rPr>
+    </w:lvl>
+  </w:abstractNum>
+  <w:abstractNum w:abstractNumId="38">
+    <w:nsid w:val="3B7B2796"/>
+    <w:multiLevelType w:val="hybridMultilevel"/>
+    <w:lvl w:ilvl="0" w:tplc="045E09CB">
+      <w:start w:val="1"/>
+      <w:numFmt w:val="bullet"/>
+      <w:suff w:val="tab"/>
+      <w:lvlText w:val="·"/>
+      <w:lvlJc w:val="left"/>
+      <w:pPr>
+        <w:ind w:hanging="360" w:left="720"/>
+      </w:pPr>
+      <w:rPr>
+        <w:rFonts w:ascii="Symbol" w:hAnsi="Symbol"/>
+      </w:rPr>
+    </w:lvl>
+    <w:lvl w:ilvl="1" w:tplc="20C382AD">
+      <w:start w:val="1"/>
+      <w:numFmt w:val="bullet"/>
+      <w:suff w:val="tab"/>
+      <w:lvlText w:val="o"/>
+      <w:lvlJc w:val="left"/>
+      <w:pPr>
+        <w:ind w:hanging="360" w:left="1440"/>
+      </w:pPr>
+      <w:rPr>
+        <w:rFonts w:ascii="Symbol" w:hAnsi="Symbol"/>
+      </w:rPr>
+    </w:lvl>
+    <w:lvl w:ilvl="2" w:tplc="338B8AB3">
+      <w:start w:val="1"/>
+      <w:numFmt w:val="bullet"/>
+      <w:suff w:val="tab"/>
+      <w:lvlText w:val="·"/>
+      <w:lvlJc w:val="left"/>
+      <w:pPr>
+        <w:ind w:hanging="360" w:left="2160"/>
+      </w:pPr>
+      <w:rPr>
+        <w:rFonts w:ascii="Symbol" w:hAnsi="Symbol"/>
+      </w:rPr>
+    </w:lvl>
+    <w:lvl w:ilvl="3" w:tplc="46A7A68E">
+      <w:start w:val="1"/>
+      <w:numFmt w:val="bullet"/>
+      <w:suff w:val="tab"/>
+      <w:lvlText w:val="o"/>
+      <w:lvlJc w:val="left"/>
+      <w:pPr>
+        <w:ind w:hanging="360" w:left="2880"/>
+      </w:pPr>
+      <w:rPr>
+        <w:rFonts w:ascii="Symbol" w:hAnsi="Symbol"/>
+      </w:rPr>
+    </w:lvl>
+    <w:lvl w:ilvl="4" w:tplc="6167D2E5">
+      <w:start w:val="1"/>
+      <w:numFmt w:val="bullet"/>
+      <w:suff w:val="tab"/>
+      <w:lvlText w:val="·"/>
+      <w:lvlJc w:val="left"/>
+      <w:pPr>
+        <w:ind w:hanging="360" w:left="3600"/>
+      </w:pPr>
+      <w:rPr>
+        <w:rFonts w:ascii="Symbol" w:hAnsi="Symbol"/>
+      </w:rPr>
+    </w:lvl>
+    <w:lvl w:ilvl="5" w:tplc="6568FAEE">
+      <w:start w:val="1"/>
+      <w:numFmt w:val="bullet"/>
+      <w:suff w:val="tab"/>
+      <w:lvlText w:val="o"/>
+      <w:lvlJc w:val="left"/>
+      <w:pPr>
+        <w:ind w:hanging="360" w:left="4320"/>
+      </w:pPr>
+      <w:rPr>
+        <w:rFonts w:ascii="Symbol" w:hAnsi="Symbol"/>
+      </w:rPr>
+    </w:lvl>
+    <w:lvl w:ilvl="6" w:tplc="54AE3BCA">
+      <w:start w:val="1"/>
+      <w:numFmt w:val="bullet"/>
+      <w:suff w:val="tab"/>
+      <w:lvlText w:val="·"/>
+      <w:lvlJc w:val="left"/>
+      <w:pPr>
+        <w:ind w:hanging="360" w:left="5040"/>
+      </w:pPr>
+      <w:rPr>
+        <w:rFonts w:ascii="Symbol" w:hAnsi="Symbol"/>
+      </w:rPr>
+    </w:lvl>
+    <w:lvl w:ilvl="7" w:tplc="56216E48">
+      <w:start w:val="1"/>
+      <w:numFmt w:val="bullet"/>
+      <w:suff w:val="tab"/>
+      <w:lvlText w:val="o"/>
+      <w:lvlJc w:val="left"/>
+      <w:pPr>
+        <w:ind w:hanging="360" w:left="5760"/>
+      </w:pPr>
+      <w:rPr>
+        <w:rFonts w:ascii="Symbol" w:hAnsi="Symbol"/>
+      </w:rPr>
+    </w:lvl>
+    <w:lvl w:ilvl="8" w:tplc="7A4B190C">
       <w:start w:val="1"/>
       <w:numFmt w:val="bullet"/>
       <w:suff w:val="tab"/>
@@ -7156,6 +7799,9 @@
   </w:num>
   <w:num w:numId="38">
     <w:abstractNumId w:val="37"/>
+  </w:num>
+  <w:num w:numId="39">
+    <w:abstractNumId w:val="38"/>
   </w:num>
 </w:numbering>
 </file>

</xml_diff>